<commit_message>
feat(hospital): add occupancy history, structure edit/delete, room_number compatibility, and unique indexes
</commit_message>
<xml_diff>
--- a/Guide_Utilisation_SoftMed.docx
+++ b/Guide_Utilisation_SoftMed.docx
@@ -414,7 +414,7 @@
           <w:sz w:val="22"/>
           <w:szCs w:val="22"/>
         </w:rPr>
-        <w:t xml:space="preserve">3. Module 1 : Agenda, Calendrier &amp; Prise de Rendez-Vous</w:t>
+        <w:t xml:space="preserve">3. Module 1 : Agenda, Calendrier des Consultations (Tranches 15 min) &amp; Prise de Rendez-Vous Multicanale</w:t>
       </w:r>
     </w:p>
     <w:p>
@@ -542,39 +542,55 @@
           <w:sz w:val="22"/>
           <w:szCs w:val="22"/>
         </w:rPr>
-        <w:t xml:space="preserve">11. Module 9 : Structure Médicale, Praticiens &amp; Spécialités</w:t>
-      </w:r>
-    </w:p>
-    <w:p>
-      <w:pPr>
-        <w:spacing w:after="120" w:line="280"/>
-      </w:pPr>
-      <w:r>
-        <w:rPr>
-          <w:rFonts w:ascii="Segoe UI" w:cs="Segoe UI" w:eastAsia="Segoe UI" w:hAnsi="Segoe UI"/>
-          <w:b w:val="false"/>
-          <w:bCs w:val="false"/>
-          <w:color w:val="1E293B"/>
-          <w:sz w:val="22"/>
-          <w:szCs w:val="22"/>
-        </w:rPr>
-        <w:t xml:space="preserve">12. Module 10 : Administration, Droits d'Accès &amp; Configuration des Serveurs SMTP</w:t>
-      </w:r>
-    </w:p>
-    <w:p>
-      <w:pPr>
-        <w:spacing w:after="120" w:line="280"/>
-      </w:pPr>
-      <w:r>
-        <w:rPr>
-          <w:rFonts w:ascii="Segoe UI" w:cs="Segoe UI" w:eastAsia="Segoe UI" w:hAnsi="Segoe UI"/>
-          <w:b w:val="false"/>
-          <w:bCs w:val="false"/>
-          <w:color w:val="1E293B"/>
-          <w:sz w:val="22"/>
-          <w:szCs w:val="22"/>
-        </w:rPr>
-        <w:t xml:space="preserve">13. Fiches Mémo Pratiques par Rôle Métier</w:t>
+        <w:t xml:space="preserve">11. Module 9 : Structure Sanitaire, Praticiens &amp; Spécialités</w:t>
+      </w:r>
+    </w:p>
+    <w:p>
+      <w:pPr>
+        <w:spacing w:after="120" w:line="280"/>
+      </w:pPr>
+      <w:r>
+        <w:rPr>
+          <w:rFonts w:ascii="Segoe UI" w:cs="Segoe UI" w:eastAsia="Segoe UI" w:hAnsi="Segoe UI"/>
+          <w:b w:val="false"/>
+          <w:bCs w:val="false"/>
+          <w:color w:val="1E293B"/>
+          <w:sz w:val="22"/>
+          <w:szCs w:val="22"/>
+        </w:rPr>
+        <w:t xml:space="preserve">12. Module 10 : Intelligence Artificielle Médicale, Copilote DPI &amp; Moteurs LLM Multi-Fournisseurs</w:t>
+      </w:r>
+    </w:p>
+    <w:p>
+      <w:pPr>
+        <w:spacing w:after="120" w:line="280"/>
+      </w:pPr>
+      <w:r>
+        <w:rPr>
+          <w:rFonts w:ascii="Segoe UI" w:cs="Segoe UI" w:eastAsia="Segoe UI" w:hAnsi="Segoe UI"/>
+          <w:b w:val="false"/>
+          <w:bCs w:val="false"/>
+          <w:color w:val="1E293B"/>
+          <w:sz w:val="22"/>
+          <w:szCs w:val="22"/>
+        </w:rPr>
+        <w:t xml:space="preserve">13. Module 11 : Administration, Droits d'Accès &amp; Configuration des Serveurs SMTP</w:t>
+      </w:r>
+    </w:p>
+    <w:p>
+      <w:pPr>
+        <w:spacing w:after="120" w:line="280"/>
+      </w:pPr>
+      <w:r>
+        <w:rPr>
+          <w:rFonts w:ascii="Segoe UI" w:cs="Segoe UI" w:eastAsia="Segoe UI" w:hAnsi="Segoe UI"/>
+          <w:b w:val="false"/>
+          <w:bCs w:val="false"/>
+          <w:color w:val="1E293B"/>
+          <w:sz w:val="22"/>
+          <w:szCs w:val="22"/>
+        </w:rPr>
+        <w:t xml:space="preserve">14. Fiches Mémo Pratiques par Rôle Métier</w:t>
       </w:r>
     </w:p>
     <w:p>
@@ -616,7 +632,7 @@
           <w:sz w:val="22"/>
           <w:szCs w:val="22"/>
         </w:rPr>
-        <w:t xml:space="preserve">SoftMed est une solution médicale et hospitalière développée par Soft Services Technologiques (SST). Elle est conçue pour être utilisable facilement par tout le personnel soignant et administratif, sans nécessiter d'expertise informatique.</w:t>
+        <w:t xml:space="preserve">SoftMed est une solution médicale et hospitalière d'excellence développée par Soft Services Technologiques (SST). Elle est conçue pour être utilisable facilement par tout le personnel soignant et administratif d'une structure sanitaire, sans nécessiter d'expertise informatique.</w:t>
       </w:r>
     </w:p>
     <w:p>
@@ -664,7 +680,7 @@
           <w:sz w:val="22"/>
           <w:szCs w:val="22"/>
         </w:rPr>
-        <w:t xml:space="preserve">• Sécuriser les prescriptions médicales avec code QR anti-contrefaçon.</w:t>
+        <w:t xml:space="preserve">• Sécuriser les prescriptions médicales avec code QR anti-contrefaçon et vérification en temps réel.</w:t>
       </w:r>
     </w:p>
     <w:p>
@@ -712,7 +728,23 @@
           <w:sz w:val="22"/>
           <w:szCs w:val="22"/>
         </w:rPr>
-        <w:t xml:space="preserve">• Transmettre directement les factures et justificatifs par courrier électronique sécurisé.</w:t>
+        <w:t xml:space="preserve">• Offrir une prise de rendez-vous intelligente 24h/24 par portail web, WhatsApp et Agent Vocal IA interactif.</w:t>
+      </w:r>
+    </w:p>
+    <w:p>
+      <w:pPr>
+        <w:spacing w:after="120" w:line="280"/>
+      </w:pPr>
+      <w:r>
+        <w:rPr>
+          <w:rFonts w:ascii="Segoe UI" w:cs="Segoe UI" w:eastAsia="Segoe UI" w:hAnsi="Segoe UI"/>
+          <w:b w:val="false"/>
+          <w:bCs w:val="false"/>
+          <w:color w:val="1E293B"/>
+          <w:sz w:val="22"/>
+          <w:szCs w:val="22"/>
+        </w:rPr>
+        <w:t xml:space="preserve">• Intégrer les meilleurs modèles d'Intelligence Artificielle (Gemini, Claude, DeepSeek, OpenRouter, AIML API...) pour assister les praticiens.</w:t>
       </w:r>
     </w:p>
     <w:p>
@@ -753,39 +785,39 @@
           <w:sz w:val="22"/>
           <w:szCs w:val="22"/>
         </w:rPr>
-        <w:t xml:space="preserve">1. Le Menu de Gauche (Bleu Nuit) : Permet de choisir le service où vous travaillez (Tableau de Bord, Agenda, Patients &amp; DPI, Caisse, Pharmacie, Paramètres...).</w:t>
-      </w:r>
-    </w:p>
-    <w:p>
-      <w:pPr>
-        <w:spacing w:after="120" w:line="280"/>
-      </w:pPr>
-      <w:r>
-        <w:rPr>
-          <w:rFonts w:ascii="Segoe UI" w:cs="Segoe UI" w:eastAsia="Segoe UI" w:hAnsi="Segoe UI"/>
-          <w:b w:val="false"/>
-          <w:bCs w:val="false"/>
-          <w:color w:val="1E293B"/>
-          <w:sz w:val="22"/>
-          <w:szCs w:val="22"/>
-        </w:rPr>
-        <w:t xml:space="preserve">2. Le Bandeau Supérieur : Affiche le nom de la clinique active et votre profil connecté.</w:t>
-      </w:r>
-    </w:p>
-    <w:p>
-      <w:pPr>
-        <w:spacing w:after="120" w:line="280"/>
-      </w:pPr>
-      <w:r>
-        <w:rPr>
-          <w:rFonts w:ascii="Segoe UI" w:cs="Segoe UI" w:eastAsia="Segoe UI" w:hAnsi="Segoe UI"/>
-          <w:b w:val="false"/>
-          <w:bCs w:val="false"/>
-          <w:color w:val="1E293B"/>
-          <w:sz w:val="22"/>
-          <w:szCs w:val="22"/>
-        </w:rPr>
-        <w:t xml:space="preserve">3. La Zone de Travail Centrale : Affiche les fiches, dossiers et tableaux avec de grands boutons bien visibles.</w:t>
+        <w:t xml:space="preserve">1. Le Menu de Gauche (Bleu Nuit) : Permet de naviguer entre les services (Tableau de Bord, Agenda, Patients &amp; DPI, Caisse, Pharmacie, Structure Sanitaire, Paramètres...).</w:t>
+      </w:r>
+    </w:p>
+    <w:p>
+      <w:pPr>
+        <w:spacing w:after="120" w:line="280"/>
+      </w:pPr>
+      <w:r>
+        <w:rPr>
+          <w:rFonts w:ascii="Segoe UI" w:cs="Segoe UI" w:eastAsia="Segoe UI" w:hAnsi="Segoe UI"/>
+          <w:b w:val="false"/>
+          <w:bCs w:val="false"/>
+          <w:color w:val="1E293B"/>
+          <w:sz w:val="22"/>
+          <w:szCs w:val="22"/>
+        </w:rPr>
+        <w:t xml:space="preserve">2. Le Bandeau Supérieur : Affiche le nom de la structure sanitaire active, la langue (Français / Arabe) et votre profil connecté.</w:t>
+      </w:r>
+    </w:p>
+    <w:p>
+      <w:pPr>
+        <w:spacing w:after="120" w:line="280"/>
+      </w:pPr>
+      <w:r>
+        <w:rPr>
+          <w:rFonts w:ascii="Segoe UI" w:cs="Segoe UI" w:eastAsia="Segoe UI" w:hAnsi="Segoe UI"/>
+          <w:b w:val="false"/>
+          <w:bCs w:val="false"/>
+          <w:color w:val="1E293B"/>
+          <w:sz w:val="22"/>
+          <w:szCs w:val="22"/>
+        </w:rPr>
+        <w:t xml:space="preserve">3. La Zone de Travail Centrale : Affiche les dossiers, calendriers et tableaux interactifs avec de grands boutons clairs.</w:t>
       </w:r>
     </w:p>
     <w:tbl>
@@ -926,33 +958,33 @@
           <w:sz w:val="22"/>
           <w:szCs w:val="22"/>
         </w:rPr>
-        <w:t xml:space="preserve">Tapez l'adresse web de votre établissement (ex : http://localhost:5000 ou l'adresse fournie par l'administrateur).</w:t>
-      </w:r>
-    </w:p>
-    <w:p>
-      <w:pPr>
-        <w:spacing w:after="110" w:before="90" w:line="280"/>
-        <w:ind w:left="360"/>
-      </w:pPr>
-      <w:r>
-        <w:rPr>
-          <w:rFonts w:ascii="Segoe UI" w:cs="Segoe UI" w:eastAsia="Segoe UI" w:hAnsi="Segoe UI"/>
-          <w:b/>
-          <w:bCs/>
-          <w:color w:val="1D4ED8"/>
-          <w:sz w:val="22"/>
-          <w:szCs w:val="22"/>
-        </w:rPr>
-        <w:t xml:space="preserve">Étape 3 : Entrer l'Identifiant Clinique (Slug) — </w:t>
-      </w:r>
-      <w:r>
-        <w:rPr>
-          <w:rFonts w:ascii="Segoe UI" w:cs="Segoe UI" w:eastAsia="Segoe UI" w:hAnsi="Segoe UI"/>
-          <w:color w:val="334155"/>
-          <w:sz w:val="22"/>
-          <w:szCs w:val="22"/>
-        </w:rPr>
-        <w:t xml:space="preserve">Saisissez le code de votre clinique (ex : "espoir" ou "paix").</w:t>
+        <w:t xml:space="preserve">Tapez l'adresse web de votre établissement (ex : https://softmed.com.co).</w:t>
+      </w:r>
+    </w:p>
+    <w:p>
+      <w:pPr>
+        <w:spacing w:after="110" w:before="90" w:line="280"/>
+        <w:ind w:left="360"/>
+      </w:pPr>
+      <w:r>
+        <w:rPr>
+          <w:rFonts w:ascii="Segoe UI" w:cs="Segoe UI" w:eastAsia="Segoe UI" w:hAnsi="Segoe UI"/>
+          <w:b/>
+          <w:bCs/>
+          <w:color w:val="1D4ED8"/>
+          <w:sz w:val="22"/>
+          <w:szCs w:val="22"/>
+        </w:rPr>
+        <w:t xml:space="preserve">Étape 3 : Entrer l'Identifiant Structure Sanitaire (Slug) — </w:t>
+      </w:r>
+      <w:r>
+        <w:rPr>
+          <w:rFonts w:ascii="Segoe UI" w:cs="Segoe UI" w:eastAsia="Segoe UI" w:hAnsi="Segoe UI"/>
+          <w:color w:val="334155"/>
+          <w:sz w:val="22"/>
+          <w:szCs w:val="22"/>
+        </w:rPr>
+        <w:t xml:space="preserve">Saisissez l'identifiant court de votre structure (ex : "espoir" ou "paix").</w:t>
       </w:r>
     </w:p>
     <w:p>
@@ -978,7 +1010,7 @@
           <w:sz w:val="22"/>
           <w:szCs w:val="22"/>
         </w:rPr>
-        <w:t xml:space="preserve">Tapez votre adresse email et votre mot de passe secret.</w:t>
+        <w:t xml:space="preserve">Tapez votre adresse email professionnelle et votre mot de passe secret.</w:t>
       </w:r>
     </w:p>
     <w:p>
@@ -1004,7 +1036,7 @@
           <w:sz w:val="22"/>
           <w:szCs w:val="22"/>
         </w:rPr>
-        <w:t xml:space="preserve">Cliquez sur le bouton bleu « Accéder à ma clinique ».</w:t>
+        <w:t xml:space="preserve">Cliquez sur le bouton bleu « Accéder à ma structure ».</w:t>
       </w:r>
     </w:p>
     <w:tbl>
@@ -1052,7 +1084,7 @@
                 <w:sz w:val="20"/>
                 <w:szCs w:val="20"/>
               </w:rPr>
-              <w:t xml:space="preserve">📷 [Capture d'écran : Écran de connexion avec les champs Identifiant Clinique, Email et Mot de passe]</w:t>
+              <w:t xml:space="preserve">📷 [Capture d'écran : Écran de connexion avec les champs Identifiant Structure Sanitaire, Email et Mot de passe]</w:t>
             </w:r>
           </w:p>
           <w:p>
@@ -1183,7 +1215,7 @@
                 <w:sz w:val="20"/>
                 <w:szCs w:val="20"/>
               </w:rPr>
-              <w:t xml:space="preserve">Ne donnez jamais vos identifiants à une autre personne. Chaque ordonnance rédigée ou encaissement réalisé est enregistré avec le nom de l'utilisateur connecté.</w:t>
+              <w:t xml:space="preserve">Ne donnez jamais vos identifiants à un tiers. Chaque ordonnance rédigée ou encaissement réalisé est tracé avec le nom de l'utilisateur connecté.</w:t>
             </w:r>
           </w:p>
         </w:tc>
@@ -1203,7 +1235,7 @@
         <w:spacing w:after="220" w:before="460"/>
       </w:pPr>
       <w:r>
-        <w:t xml:space="preserve">3. Agenda &amp; Prise de Rendez-Vous</w:t>
+        <w:t xml:space="preserve">3. Agenda &amp; Calendrier des Consultations (Tranches 15 min)</w:t>
       </w:r>
     </w:p>
     <w:p>
@@ -1212,23 +1244,71 @@
         <w:spacing w:after="140" w:before="320"/>
       </w:pPr>
       <w:r>
-        <w:t xml:space="preserve">3.1. Objectifs &amp; Utilité</w:t>
-      </w:r>
-    </w:p>
-    <w:p>
-      <w:pPr>
-        <w:spacing w:after="120" w:line="280"/>
-      </w:pPr>
-      <w:r>
-        <w:rPr>
-          <w:rFonts w:ascii="Segoe UI" w:cs="Segoe UI" w:eastAsia="Segoe UI" w:hAnsi="Segoe UI"/>
-          <w:b w:val="false"/>
-          <w:bCs w:val="false"/>
-          <w:color w:val="1E293B"/>
-          <w:sz w:val="22"/>
-          <w:szCs w:val="22"/>
-        </w:rPr>
-        <w:t xml:space="preserve">L'Agenda permet d'enregistrer les rendez-vous pris au guichet ou par téléphone, de visualiser les disponibilités des médecins et de réduire le temps d'attente des patients.</w:t>
+        <w:t xml:space="preserve">3.1. Organisation du Calendrier en Tranches de 15 minutes</w:t>
+      </w:r>
+    </w:p>
+    <w:p>
+      <w:pPr>
+        <w:spacing w:after="120" w:line="280"/>
+      </w:pPr>
+      <w:r>
+        <w:rPr>
+          <w:rFonts w:ascii="Segoe UI" w:cs="Segoe UI" w:eastAsia="Segoe UI" w:hAnsi="Segoe UI"/>
+          <w:b w:val="false"/>
+          <w:bCs w:val="false"/>
+          <w:color w:val="1E293B"/>
+          <w:sz w:val="22"/>
+          <w:szCs w:val="22"/>
+        </w:rPr>
+        <w:t xml:space="preserve">L'Agenda propose une grille horaire de 08h00 à 19h00 découpée en tranches précises de 15 minutes (08:00, 08:15, 08:30, 08:45...).</w:t>
+      </w:r>
+    </w:p>
+    <w:p>
+      <w:pPr>
+        <w:spacing w:after="120" w:line="280"/>
+      </w:pPr>
+      <w:r>
+        <w:rPr>
+          <w:rFonts w:ascii="Segoe UI" w:cs="Segoe UI" w:eastAsia="Segoe UI" w:hAnsi="Segoe UI"/>
+          <w:b w:val="false"/>
+          <w:bCs w:val="false"/>
+          <w:color w:val="1E293B"/>
+          <w:sz w:val="22"/>
+          <w:szCs w:val="22"/>
+        </w:rPr>
+        <w:t xml:space="preserve">Un code couleur intuitif permet d'identifier la disponibilité instantanément :</w:t>
+      </w:r>
+    </w:p>
+    <w:p>
+      <w:pPr>
+        <w:spacing w:after="120" w:line="280"/>
+      </w:pPr>
+      <w:r>
+        <w:rPr>
+          <w:rFonts w:ascii="Segoe UI" w:cs="Segoe UI" w:eastAsia="Segoe UI" w:hAnsi="Segoe UI"/>
+          <w:b w:val="false"/>
+          <w:bCs w:val="false"/>
+          <w:color w:val="1E293B"/>
+          <w:sz w:val="22"/>
+          <w:szCs w:val="22"/>
+        </w:rPr>
+        <w:t xml:space="preserve">• 🟢 Tranches Libres (Vert) : Indique que le praticien est disponible. Un clic sur « + Planifier » ouvre directement la prise de rendez-vous.</w:t>
+      </w:r>
+    </w:p>
+    <w:p>
+      <w:pPr>
+        <w:spacing w:after="120" w:line="280"/>
+      </w:pPr>
+      <w:r>
+        <w:rPr>
+          <w:rFonts w:ascii="Segoe UI" w:cs="Segoe UI" w:eastAsia="Segoe UI" w:hAnsi="Segoe UI"/>
+          <w:b w:val="false"/>
+          <w:bCs w:val="false"/>
+          <w:color w:val="1E293B"/>
+          <w:sz w:val="22"/>
+          <w:szCs w:val="22"/>
+        </w:rPr>
+        <w:t xml:space="preserve">• 🔴 Tranches Occupées (Rouge) : Affiche le patient, son code unique (ex: SM-4821), le motif précis de consultation, le tarif en FCFA et le canal de réservation (Vocal IA, WhatsApp, En ligne, Guichet).</w:t>
       </w:r>
     </w:p>
     <w:p>
@@ -1237,7 +1317,7 @@
         <w:spacing w:after="140" w:before="320"/>
       </w:pPr>
       <w:r>
-        <w:t xml:space="preserve">3.2. Comment planifier un Rendez-Vous en 4 étapes</w:t>
+        <w:t xml:space="preserve">3.2. Planifier un Rendez-Vous au Guichet ou par Téléphone</w:t>
       </w:r>
     </w:p>
     <w:p>
@@ -1280,68 +1360,141 @@
           <w:sz w:val="22"/>
           <w:szCs w:val="22"/>
         </w:rPr>
-        <w:t xml:space="preserve">Étape 2 : Choisir le Médecin — </w:t>
-      </w:r>
-      <w:r>
-        <w:rPr>
-          <w:rFonts w:ascii="Segoe UI" w:cs="Segoe UI" w:eastAsia="Segoe UI" w:hAnsi="Segoe UI"/>
-          <w:color w:val="334155"/>
-          <w:sz w:val="22"/>
-          <w:szCs w:val="22"/>
-        </w:rPr>
-        <w:t xml:space="preserve">Dans le menu déroulant en haut, sélectionnez le médecin demandé.</w:t>
-      </w:r>
-    </w:p>
-    <w:p>
-      <w:pPr>
-        <w:spacing w:after="110" w:before="90" w:line="280"/>
-        <w:ind w:left="360"/>
-      </w:pPr>
-      <w:r>
-        <w:rPr>
-          <w:rFonts w:ascii="Segoe UI" w:cs="Segoe UI" w:eastAsia="Segoe UI" w:hAnsi="Segoe UI"/>
-          <w:b/>
-          <w:bCs/>
-          <w:color w:val="1D4ED8"/>
-          <w:sz w:val="22"/>
-          <w:szCs w:val="22"/>
-        </w:rPr>
-        <w:t xml:space="preserve">Étape 3 : Sélectionner le Patient et l'Acte — </w:t>
-      </w:r>
-      <w:r>
-        <w:rPr>
-          <w:rFonts w:ascii="Segoe UI" w:cs="Segoe UI" w:eastAsia="Segoe UI" w:hAnsi="Segoe UI"/>
-          <w:color w:val="334155"/>
-          <w:sz w:val="22"/>
-          <w:szCs w:val="22"/>
-        </w:rPr>
-        <w:t xml:space="preserve">Tapez le nom du patient et choisissez le type de consultation (Générale, Spécialisée, Échographie...).</w:t>
-      </w:r>
-    </w:p>
-    <w:p>
-      <w:pPr>
-        <w:spacing w:after="110" w:before="90" w:line="280"/>
-        <w:ind w:left="360"/>
-      </w:pPr>
-      <w:r>
-        <w:rPr>
-          <w:rFonts w:ascii="Segoe UI" w:cs="Segoe UI" w:eastAsia="Segoe UI" w:hAnsi="Segoe UI"/>
-          <w:b/>
-          <w:bCs/>
-          <w:color w:val="1D4ED8"/>
-          <w:sz w:val="22"/>
-          <w:szCs w:val="22"/>
-        </w:rPr>
-        <w:t xml:space="preserve">Étape 4 : Fixer l'Heure et Enregistrer — </w:t>
-      </w:r>
-      <w:r>
-        <w:rPr>
-          <w:rFonts w:ascii="Segoe UI" w:cs="Segoe UI" w:eastAsia="Segoe UI" w:hAnsi="Segoe UI"/>
-          <w:color w:val="334155"/>
-          <w:sz w:val="22"/>
-          <w:szCs w:val="22"/>
-        </w:rPr>
-        <w:t xml:space="preserve">Indiquez la date et l'heure puis cliquez sur « Enregistrer le RDV ».</w:t>
+        <w:t xml:space="preserve">Étape 2 : Choisir le Praticien et la Date — </w:t>
+      </w:r>
+      <w:r>
+        <w:rPr>
+          <w:rFonts w:ascii="Segoe UI" w:cs="Segoe UI" w:eastAsia="Segoe UI" w:hAnsi="Segoe UI"/>
+          <w:color w:val="334155"/>
+          <w:sz w:val="22"/>
+          <w:szCs w:val="22"/>
+        </w:rPr>
+        <w:t xml:space="preserve">Sélectionnez le médecin dans la colonne de gauche et le jour souhaité sur le calendrier.</w:t>
+      </w:r>
+    </w:p>
+    <w:p>
+      <w:pPr>
+        <w:spacing w:after="110" w:before="90" w:line="280"/>
+        <w:ind w:left="360"/>
+      </w:pPr>
+      <w:r>
+        <w:rPr>
+          <w:rFonts w:ascii="Segoe UI" w:cs="Segoe UI" w:eastAsia="Segoe UI" w:hAnsi="Segoe UI"/>
+          <w:b/>
+          <w:bCs/>
+          <w:color w:val="1D4ED8"/>
+          <w:sz w:val="22"/>
+          <w:szCs w:val="22"/>
+        </w:rPr>
+        <w:t xml:space="preserve">Étape 3 : Cliquer sur la tranche libre — </w:t>
+      </w:r>
+      <w:r>
+        <w:rPr>
+          <w:rFonts w:ascii="Segoe UI" w:cs="Segoe UI" w:eastAsia="Segoe UI" w:hAnsi="Segoe UI"/>
+          <w:color w:val="334155"/>
+          <w:sz w:val="22"/>
+          <w:szCs w:val="22"/>
+        </w:rPr>
+        <w:t xml:space="preserve">Cliquez sur « + Planifier » en face de l'heure désirée (ex: 10h15).</w:t>
+      </w:r>
+    </w:p>
+    <w:p>
+      <w:pPr>
+        <w:spacing w:after="110" w:before="90" w:line="280"/>
+        <w:ind w:left="360"/>
+      </w:pPr>
+      <w:r>
+        <w:rPr>
+          <w:rFonts w:ascii="Segoe UI" w:cs="Segoe UI" w:eastAsia="Segoe UI" w:hAnsi="Segoe UI"/>
+          <w:b/>
+          <w:bCs/>
+          <w:color w:val="1D4ED8"/>
+          <w:sz w:val="22"/>
+          <w:szCs w:val="22"/>
+        </w:rPr>
+        <w:t xml:space="preserve">Étape 4 : Sélectionner le Patient et le Motif — </w:t>
+      </w:r>
+      <w:r>
+        <w:rPr>
+          <w:rFonts w:ascii="Segoe UI" w:cs="Segoe UI" w:eastAsia="Segoe UI" w:hAnsi="Segoe UI"/>
+          <w:color w:val="334155"/>
+          <w:sz w:val="22"/>
+          <w:szCs w:val="22"/>
+        </w:rPr>
+        <w:t xml:space="preserve">Recherchez le patient par son code ou son nom, renseignez le motif de consultation et validez.</w:t>
+      </w:r>
+    </w:p>
+    <w:p>
+      <w:pPr>
+        <w:pStyle w:val="Heading2"/>
+        <w:spacing w:after="140" w:before="320"/>
+      </w:pPr>
+      <w:r>
+        <w:t xml:space="preserve">3.3. Prise de Rendez-Vous en Ligne Multicanale (Patients 24h/24)</w:t>
+      </w:r>
+    </w:p>
+    <w:p>
+      <w:pPr>
+        <w:spacing w:after="120" w:line="280"/>
+      </w:pPr>
+      <w:r>
+        <w:rPr>
+          <w:rFonts w:ascii="Segoe UI" w:cs="Segoe UI" w:eastAsia="Segoe UI" w:hAnsi="Segoe UI"/>
+          <w:b w:val="false"/>
+          <w:bCs w:val="false"/>
+          <w:color w:val="1E293B"/>
+          <w:sz w:val="22"/>
+          <w:szCs w:val="22"/>
+        </w:rPr>
+        <w:t xml:space="preserve">Chaque structure sanitaire dispose d'un lien public direct (ex: https://softmed.com.co/rdv/paix) partageable sur WhatsApp :</w:t>
+      </w:r>
+    </w:p>
+    <w:p>
+      <w:pPr>
+        <w:spacing w:after="120" w:line="280"/>
+      </w:pPr>
+      <w:r>
+        <w:rPr>
+          <w:rFonts w:ascii="Segoe UI" w:cs="Segoe UI" w:eastAsia="Segoe UI" w:hAnsi="Segoe UI"/>
+          <w:b w:val="false"/>
+          <w:bCs w:val="false"/>
+          <w:color w:val="1E293B"/>
+          <w:sz w:val="22"/>
+          <w:szCs w:val="22"/>
+        </w:rPr>
+        <w:t xml:space="preserve">1. Portail Web Patient : Prise de RDV instantanée en 3 étapes.</w:t>
+      </w:r>
+    </w:p>
+    <w:p>
+      <w:pPr>
+        <w:spacing w:after="120" w:line="280"/>
+      </w:pPr>
+      <w:r>
+        <w:rPr>
+          <w:rFonts w:ascii="Segoe UI" w:cs="Segoe UI" w:eastAsia="Segoe UI" w:hAnsi="Segoe UI"/>
+          <w:b w:val="false"/>
+          <w:bCs w:val="false"/>
+          <w:color w:val="1E293B"/>
+          <w:sz w:val="22"/>
+          <w:szCs w:val="22"/>
+        </w:rPr>
+        <w:t xml:space="preserve">2. Agent Vocal Interactif IA : Le patient dialogue à voix haute avec l'assistant.</w:t>
+      </w:r>
+    </w:p>
+    <w:p>
+      <w:pPr>
+        <w:spacing w:after="120" w:line="280"/>
+      </w:pPr>
+      <w:r>
+        <w:rPr>
+          <w:rFonts w:ascii="Segoe UI" w:cs="Segoe UI" w:eastAsia="Segoe UI" w:hAnsi="Segoe UI"/>
+          <w:b w:val="false"/>
+          <w:bCs w:val="false"/>
+          <w:color w:val="1E293B"/>
+          <w:sz w:val="22"/>
+          <w:szCs w:val="22"/>
+        </w:rPr>
+        <w:t xml:space="preserve">3. Assistant WhatsApp : Échange conversationnel et génération du pass numérique.</w:t>
       </w:r>
     </w:p>
     <w:tbl>
@@ -1389,7 +1542,7 @@
                 <w:sz w:val="20"/>
                 <w:szCs w:val="20"/>
               </w:rPr>
-              <w:t xml:space="preserve">📷 [Capture d'écran : Calendrier hebdomadaire et formulaire d'enregistrement de rendez-vous]</w:t>
+              <w:t xml:space="preserve">📷 [Capture d'écran : Calendrier des consultations avec tranches de 15 minutes en Vert (Libre) et Rouge (Occupé)]</w:t>
             </w:r>
           </w:p>
           <w:p>
@@ -1538,7 +1691,7 @@
           <w:sz w:val="22"/>
           <w:szCs w:val="22"/>
         </w:rPr>
-        <w:t xml:space="preserve">Indiquez le nom, prénom, numéro de téléphone, date de naissance, groupe sanguin et adresse.</w:t>
+        <w:t xml:space="preserve">Indiquez le nom, prénom, numéro de téléphone, date de naissance, statut (Interne / Externe), groupe sanguin et adresse.</w:t>
       </w:r>
     </w:p>
     <w:p>
@@ -1590,7 +1743,7 @@
           <w:sz w:val="22"/>
           <w:szCs w:val="22"/>
         </w:rPr>
-        <w:t xml:space="preserve">Cliquez sur « Créer le dossier patient ». Le numéro de dossier (ex : PAT-2026-00048) est créé.</w:t>
+        <w:t xml:space="preserve">Cliquez sur « Créer le dossier patient ». Le code unique (ex : SM-4821) est attribué.</w:t>
       </w:r>
     </w:p>
     <w:tbl>
@@ -1638,7 +1791,7 @@
                 <w:sz w:val="20"/>
                 <w:szCs w:val="20"/>
               </w:rPr>
-              <w:t xml:space="preserve">📷 [Capture d'écran : Registre des patients et formulaire de création de dossier]</w:t>
+              <w:t xml:space="preserve">📷 [Capture d'écran : Registre des patients et dossier DPI 360° avec constantes et antécédents]</w:t>
             </w:r>
           </w:p>
           <w:p>
@@ -1667,87 +1820,137 @@
         <w:spacing w:after="140" w:before="320"/>
       </w:pPr>
       <w:r>
-        <w:t xml:space="preserve">4.3. Consulter le Dossier Médical Partagé (DPI 360°)</w:t>
-      </w:r>
-    </w:p>
-    <w:p>
-      <w:pPr>
-        <w:spacing w:after="120" w:line="280"/>
-      </w:pPr>
-      <w:r>
-        <w:rPr>
-          <w:rFonts w:ascii="Segoe UI" w:cs="Segoe UI" w:eastAsia="Segoe UI" w:hAnsi="Segoe UI"/>
-          <w:b w:val="false"/>
-          <w:bCs w:val="false"/>
-          <w:color w:val="1E293B"/>
-          <w:sz w:val="22"/>
-          <w:szCs w:val="22"/>
-        </w:rPr>
-        <w:t xml:space="preserve">Cliquez sur le bouton vert « Dossier DPI 360° » pour accéder aux 4 onglets :</w:t>
-      </w:r>
-    </w:p>
-    <w:p>
-      <w:pPr>
-        <w:spacing w:after="120" w:line="280"/>
-      </w:pPr>
-      <w:r>
-        <w:rPr>
-          <w:rFonts w:ascii="Segoe UI" w:cs="Segoe UI" w:eastAsia="Segoe UI" w:hAnsi="Segoe UI"/>
-          <w:b w:val="false"/>
-          <w:bCs w:val="false"/>
-          <w:color w:val="1E293B"/>
-          <w:sz w:val="22"/>
-          <w:szCs w:val="22"/>
-        </w:rPr>
-        <w:t xml:space="preserve">• Onglet 1 - Synthèse &amp; Constantes : Poids, taille, tension artérielle, IMC, statut (Ambulatoire, Hospitalisé).</w:t>
-      </w:r>
-    </w:p>
-    <w:p>
-      <w:pPr>
-        <w:spacing w:after="120" w:line="280"/>
-      </w:pPr>
-      <w:r>
-        <w:rPr>
-          <w:rFonts w:ascii="Segoe UI" w:cs="Segoe UI" w:eastAsia="Segoe UI" w:hAnsi="Segoe UI"/>
-          <w:b w:val="false"/>
-          <w:bCs w:val="false"/>
-          <w:color w:val="1E293B"/>
-          <w:sz w:val="22"/>
-          <w:szCs w:val="22"/>
-        </w:rPr>
-        <w:t xml:space="preserve">• Onglet 2 - Antécédents &amp; Allergies : Diabète, hypertension, allergies médicamenteuses signalées en rouge.</w:t>
-      </w:r>
-    </w:p>
-    <w:p>
-      <w:pPr>
-        <w:spacing w:after="120" w:line="280"/>
-      </w:pPr>
-      <w:r>
-        <w:rPr>
-          <w:rFonts w:ascii="Segoe UI" w:cs="Segoe UI" w:eastAsia="Segoe UI" w:hAnsi="Segoe UI"/>
-          <w:b w:val="false"/>
-          <w:bCs w:val="false"/>
-          <w:color w:val="1E293B"/>
-          <w:sz w:val="22"/>
-          <w:szCs w:val="22"/>
-        </w:rPr>
-        <w:t xml:space="preserve">• Onglet 3 - Analyses &amp; Examens : Liste des examens demandés et accès direct aux scans de laboratoire.</w:t>
-      </w:r>
-    </w:p>
-    <w:p>
-      <w:pPr>
-        <w:spacing w:after="120" w:line="280"/>
-      </w:pPr>
-      <w:r>
-        <w:rPr>
-          <w:rFonts w:ascii="Segoe UI" w:cs="Segoe UI" w:eastAsia="Segoe UI" w:hAnsi="Segoe UI"/>
-          <w:b w:val="false"/>
-          <w:bCs w:val="false"/>
-          <w:color w:val="1E293B"/>
-          <w:sz w:val="22"/>
-          <w:szCs w:val="22"/>
-        </w:rPr>
-        <w:t xml:space="preserve">• Onglet 4 - Consultations &amp; Ordonnances : Historique complet avec séparation distincte des consultations et ordonnances.</w:t>
+        <w:t xml:space="preserve">4.3. Rédiger une Consultation avec Dictée Vocale &amp; Copilote IA</w:t>
+      </w:r>
+    </w:p>
+    <w:p>
+      <w:pPr>
+        <w:spacing w:after="110" w:before="90" w:line="280"/>
+        <w:ind w:left="360"/>
+      </w:pPr>
+      <w:r>
+        <w:rPr>
+          <w:rFonts w:ascii="Segoe UI" w:cs="Segoe UI" w:eastAsia="Segoe UI" w:hAnsi="Segoe UI"/>
+          <w:b/>
+          <w:bCs/>
+          <w:color w:val="1D4ED8"/>
+          <w:sz w:val="22"/>
+          <w:szCs w:val="22"/>
+        </w:rPr>
+        <w:t xml:space="preserve">Étape 1 : Cliquer sur Nouvelle Consultation — </w:t>
+      </w:r>
+      <w:r>
+        <w:rPr>
+          <w:rFonts w:ascii="Segoe UI" w:cs="Segoe UI" w:eastAsia="Segoe UI" w:hAnsi="Segoe UI"/>
+          <w:color w:val="334155"/>
+          <w:sz w:val="22"/>
+          <w:szCs w:val="22"/>
+        </w:rPr>
+        <w:t xml:space="preserve">Dans l'onglet 4 du dossier, cliquez sur « + Nouvelle Consultation ».</w:t>
+      </w:r>
+    </w:p>
+    <w:p>
+      <w:pPr>
+        <w:spacing w:after="110" w:before="90" w:line="280"/>
+        <w:ind w:left="360"/>
+      </w:pPr>
+      <w:r>
+        <w:rPr>
+          <w:rFonts w:ascii="Segoe UI" w:cs="Segoe UI" w:eastAsia="Segoe UI" w:hAnsi="Segoe UI"/>
+          <w:b/>
+          <w:bCs/>
+          <w:color w:val="1D4ED8"/>
+          <w:sz w:val="22"/>
+          <w:szCs w:val="22"/>
+        </w:rPr>
+        <w:t xml:space="preserve">Étape 2 : Dicter les observations — </w:t>
+      </w:r>
+      <w:r>
+        <w:rPr>
+          <w:rFonts w:ascii="Segoe UI" w:cs="Segoe UI" w:eastAsia="Segoe UI" w:hAnsi="Segoe UI"/>
+          <w:color w:val="334155"/>
+          <w:sz w:val="22"/>
+          <w:szCs w:val="22"/>
+        </w:rPr>
+        <w:t xml:space="preserve">Cliquez sur « 🎙️ Démarrer Dictée » pour parler naturellement. Le système transcrit et structure les observations.</w:t>
+      </w:r>
+    </w:p>
+    <w:p>
+      <w:pPr>
+        <w:spacing w:after="110" w:before="90" w:line="280"/>
+        <w:ind w:left="360"/>
+      </w:pPr>
+      <w:r>
+        <w:rPr>
+          <w:rFonts w:ascii="Segoe UI" w:cs="Segoe UI" w:eastAsia="Segoe UI" w:hAnsi="Segoe UI"/>
+          <w:b/>
+          <w:bCs/>
+          <w:color w:val="1D4ED8"/>
+          <w:sz w:val="22"/>
+          <w:szCs w:val="22"/>
+        </w:rPr>
+        <w:t xml:space="preserve">Étape 3 : Copilote IA — </w:t>
+      </w:r>
+      <w:r>
+        <w:rPr>
+          <w:rFonts w:ascii="Segoe UI" w:cs="Segoe UI" w:eastAsia="Segoe UI" w:hAnsi="Segoe UI"/>
+          <w:color w:val="334155"/>
+          <w:sz w:val="22"/>
+          <w:szCs w:val="22"/>
+        </w:rPr>
+        <w:t xml:space="preserve">Le médecin peut solliciter l'IA pour vérifier les interactions médicamenteuses et générer la synthèse clinique.</w:t>
+      </w:r>
+    </w:p>
+    <w:p>
+      <w:pPr>
+        <w:spacing w:after="110" w:before="90" w:line="280"/>
+        <w:ind w:left="360"/>
+      </w:pPr>
+      <w:r>
+        <w:rPr>
+          <w:rFonts w:ascii="Segoe UI" w:cs="Segoe UI" w:eastAsia="Segoe UI" w:hAnsi="Segoe UI"/>
+          <w:b/>
+          <w:bCs/>
+          <w:color w:val="1D4ED8"/>
+          <w:sz w:val="22"/>
+          <w:szCs w:val="22"/>
+        </w:rPr>
+        <w:t xml:space="preserve">Étape 4 : Prescrire les médicaments — </w:t>
+      </w:r>
+      <w:r>
+        <w:rPr>
+          <w:rFonts w:ascii="Segoe UI" w:cs="Segoe UI" w:eastAsia="Segoe UI" w:hAnsi="Segoe UI"/>
+          <w:color w:val="334155"/>
+          <w:sz w:val="22"/>
+          <w:szCs w:val="22"/>
+        </w:rPr>
+        <w:t xml:space="preserve">Ajoutez les produits prescrits et leurs posologies.</w:t>
+      </w:r>
+    </w:p>
+    <w:p>
+      <w:pPr>
+        <w:spacing w:after="110" w:before="90" w:line="280"/>
+        <w:ind w:left="360"/>
+      </w:pPr>
+      <w:r>
+        <w:rPr>
+          <w:rFonts w:ascii="Segoe UI" w:cs="Segoe UI" w:eastAsia="Segoe UI" w:hAnsi="Segoe UI"/>
+          <w:b/>
+          <w:bCs/>
+          <w:color w:val="1D4ED8"/>
+          <w:sz w:val="22"/>
+          <w:szCs w:val="22"/>
+        </w:rPr>
+        <w:t xml:space="preserve">Étape 5 : Enregistrer — </w:t>
+      </w:r>
+      <w:r>
+        <w:rPr>
+          <w:rFonts w:ascii="Segoe UI" w:cs="Segoe UI" w:eastAsia="Segoe UI" w:hAnsi="Segoe UI"/>
+          <w:color w:val="334155"/>
+          <w:sz w:val="22"/>
+          <w:szCs w:val="22"/>
+        </w:rPr>
+        <w:t xml:space="preserve">Cliquez sur « Enregistrer la Consultation ». L'ordonnance officielle est générée avec son QR Code.</w:t>
       </w:r>
     </w:p>
     <w:tbl>
@@ -1795,7 +1998,7 @@
                 <w:sz w:val="20"/>
                 <w:szCs w:val="20"/>
               </w:rPr>
-              <w:t xml:space="preserve">📷 [Capture d'écran : Dossier DPI 360° ouvert avec les 4 onglets médicaux interactifs]</w:t>
+              <w:t xml:space="preserve">📷 [Capture d'écran : Formulaire de consultation médicale assistée par IA avec dictée vocale]</w:t>
             </w:r>
           </w:p>
           <w:p>
@@ -1820,115 +2023,131 @@
     </w:tbl>
     <w:p>
       <w:pPr>
+        <w:pageBreakBefore/>
+      </w:pPr>
+    </w:p>
+    <w:p>
+      <w:pPr>
+        <w:pStyle w:val="Heading1"/>
+        <w:pBdr>
+          <w:bottom w:color="0D2B45" w:sz="18" w:space="6"/>
+        </w:pBdr>
+        <w:spacing w:after="220" w:before="460"/>
+      </w:pPr>
+      <w:r>
+        <w:t xml:space="preserve">5. Ordonnances Médicales Sécurisées &amp; Anti-Fraude</w:t>
+      </w:r>
+    </w:p>
+    <w:p>
+      <w:pPr>
         <w:pStyle w:val="Heading2"/>
         <w:spacing w:after="140" w:before="320"/>
       </w:pPr>
       <w:r>
-        <w:t xml:space="preserve">4.4. Rédiger une Consultation avec Dictée Vocale IA</w:t>
-      </w:r>
-    </w:p>
-    <w:p>
-      <w:pPr>
-        <w:spacing w:after="110" w:before="90" w:line="280"/>
-        <w:ind w:left="360"/>
-      </w:pPr>
-      <w:r>
-        <w:rPr>
-          <w:rFonts w:ascii="Segoe UI" w:cs="Segoe UI" w:eastAsia="Segoe UI" w:hAnsi="Segoe UI"/>
-          <w:b/>
-          <w:bCs/>
-          <w:color w:val="1D4ED8"/>
-          <w:sz w:val="22"/>
-          <w:szCs w:val="22"/>
-        </w:rPr>
-        <w:t xml:space="preserve">Étape 1 : Cliquer sur Nouvelle Consultation — </w:t>
-      </w:r>
-      <w:r>
-        <w:rPr>
-          <w:rFonts w:ascii="Segoe UI" w:cs="Segoe UI" w:eastAsia="Segoe UI" w:hAnsi="Segoe UI"/>
-          <w:color w:val="334155"/>
-          <w:sz w:val="22"/>
-          <w:szCs w:val="22"/>
-        </w:rPr>
-        <w:t xml:space="preserve">Dans l'onglet 4 du dossier, cliquez sur « + Nouvelle Consultation ».</w:t>
-      </w:r>
-    </w:p>
-    <w:p>
-      <w:pPr>
-        <w:spacing w:after="110" w:before="90" w:line="280"/>
-        <w:ind w:left="360"/>
-      </w:pPr>
-      <w:r>
-        <w:rPr>
-          <w:rFonts w:ascii="Segoe UI" w:cs="Segoe UI" w:eastAsia="Segoe UI" w:hAnsi="Segoe UI"/>
-          <w:b/>
-          <w:bCs/>
-          <w:color w:val="1D4ED8"/>
-          <w:sz w:val="22"/>
-          <w:szCs w:val="22"/>
-        </w:rPr>
-        <w:t xml:space="preserve">Étape 2 : Dicter ou taper les observations — </w:t>
-      </w:r>
-      <w:r>
-        <w:rPr>
-          <w:rFonts w:ascii="Segoe UI" w:cs="Segoe UI" w:eastAsia="Segoe UI" w:hAnsi="Segoe UI"/>
-          <w:color w:val="334155"/>
-          <w:sz w:val="22"/>
-          <w:szCs w:val="22"/>
-        </w:rPr>
-        <w:t xml:space="preserve">Tapez le texte ou cliquez sur « 🎙️ Démarrer Dictée » pour parler directement dans le micro.</w:t>
-      </w:r>
-    </w:p>
-    <w:p>
-      <w:pPr>
-        <w:spacing w:after="110" w:before="90" w:line="280"/>
-        <w:ind w:left="360"/>
-      </w:pPr>
-      <w:r>
-        <w:rPr>
-          <w:rFonts w:ascii="Segoe UI" w:cs="Segoe UI" w:eastAsia="Segoe UI" w:hAnsi="Segoe UI"/>
-          <w:b/>
-          <w:bCs/>
-          <w:color w:val="1D4ED8"/>
-          <w:sz w:val="22"/>
-          <w:szCs w:val="22"/>
-        </w:rPr>
-        <w:t xml:space="preserve">Étape 3 : Prescrire les médicaments — </w:t>
-      </w:r>
-      <w:r>
-        <w:rPr>
-          <w:rFonts w:ascii="Segoe UI" w:cs="Segoe UI" w:eastAsia="Segoe UI" w:hAnsi="Segoe UI"/>
-          <w:color w:val="334155"/>
-          <w:sz w:val="22"/>
-          <w:szCs w:val="22"/>
-        </w:rPr>
-        <w:t xml:space="preserve">Indiquez les produits prescrits et leurs posologies.</w:t>
-      </w:r>
-    </w:p>
-    <w:p>
-      <w:pPr>
-        <w:spacing w:after="110" w:before="90" w:line="280"/>
-        <w:ind w:left="360"/>
-      </w:pPr>
-      <w:r>
-        <w:rPr>
-          <w:rFonts w:ascii="Segoe UI" w:cs="Segoe UI" w:eastAsia="Segoe UI" w:hAnsi="Segoe UI"/>
-          <w:b/>
-          <w:bCs/>
-          <w:color w:val="1D4ED8"/>
-          <w:sz w:val="22"/>
-          <w:szCs w:val="22"/>
-        </w:rPr>
-        <w:t xml:space="preserve">Étape 4 : Enregistrer — </w:t>
-      </w:r>
-      <w:r>
-        <w:rPr>
-          <w:rFonts w:ascii="Segoe UI" w:cs="Segoe UI" w:eastAsia="Segoe UI" w:hAnsi="Segoe UI"/>
-          <w:color w:val="334155"/>
-          <w:sz w:val="22"/>
-          <w:szCs w:val="22"/>
-        </w:rPr>
-        <w:t xml:space="preserve">Cliquez sur « Enregistrer la Consultation ». L'ordonnance officielle est générée.</w:t>
+        <w:t xml:space="preserve">5.1. Sécurité Cryptographique &amp; QR Code Officiel</w:t>
+      </w:r>
+    </w:p>
+    <w:p>
+      <w:pPr>
+        <w:spacing w:after="120" w:line="280"/>
+      </w:pPr>
+      <w:r>
+        <w:rPr>
+          <w:rFonts w:ascii="Segoe UI" w:cs="Segoe UI" w:eastAsia="Segoe UI" w:hAnsi="Segoe UI"/>
+          <w:b w:val="false"/>
+          <w:bCs w:val="false"/>
+          <w:color w:val="1E293B"/>
+          <w:sz w:val="22"/>
+          <w:szCs w:val="22"/>
+        </w:rPr>
+        <w:t xml:space="preserve">Chaque ordonnance émise comporte une signature numérique et un QR code officiel qui protège la structure sanitaire contre toute tentative de contrefaçon.</w:t>
+      </w:r>
+    </w:p>
+    <w:p>
+      <w:pPr>
+        <w:pStyle w:val="Heading2"/>
+        <w:spacing w:after="140" w:before="320"/>
+      </w:pPr>
+      <w:r>
+        <w:t xml:space="preserve">5.2. Imprimer et Renouveler une Ordonnance</w:t>
+      </w:r>
+    </w:p>
+    <w:p>
+      <w:pPr>
+        <w:spacing w:after="110" w:before="90" w:line="280"/>
+        <w:ind w:left="360"/>
+      </w:pPr>
+      <w:r>
+        <w:rPr>
+          <w:rFonts w:ascii="Segoe UI" w:cs="Segoe UI" w:eastAsia="Segoe UI" w:hAnsi="Segoe UI"/>
+          <w:b/>
+          <w:bCs/>
+          <w:color w:val="1D4ED8"/>
+          <w:sz w:val="22"/>
+          <w:szCs w:val="22"/>
+        </w:rPr>
+        <w:t xml:space="preserve">Étape 1 : Cliquer sur Imprimer — </w:t>
+      </w:r>
+      <w:r>
+        <w:rPr>
+          <w:rFonts w:ascii="Segoe UI" w:cs="Segoe UI" w:eastAsia="Segoe UI" w:hAnsi="Segoe UI"/>
+          <w:color w:val="334155"/>
+          <w:sz w:val="22"/>
+          <w:szCs w:val="22"/>
+        </w:rPr>
+        <w:t xml:space="preserve">Sur l'ordonnance dans le dossier, cliquez sur « Imprimer ».</w:t>
+      </w:r>
+    </w:p>
+    <w:p>
+      <w:pPr>
+        <w:spacing w:after="110" w:before="90" w:line="280"/>
+        <w:ind w:left="360"/>
+      </w:pPr>
+      <w:r>
+        <w:rPr>
+          <w:rFonts w:ascii="Segoe UI" w:cs="Segoe UI" w:eastAsia="Segoe UI" w:hAnsi="Segoe UI"/>
+          <w:b/>
+          <w:bCs/>
+          <w:color w:val="1D4ED8"/>
+          <w:sz w:val="22"/>
+          <w:szCs w:val="22"/>
+        </w:rPr>
+        <w:t xml:space="preserve">Étape 2 : Choisir le format — </w:t>
+      </w:r>
+      <w:r>
+        <w:rPr>
+          <w:rFonts w:ascii="Segoe UI" w:cs="Segoe UI" w:eastAsia="Segoe UI" w:hAnsi="Segoe UI"/>
+          <w:color w:val="334155"/>
+          <w:sz w:val="22"/>
+          <w:szCs w:val="22"/>
+        </w:rPr>
+        <w:t xml:space="preserve">Imprimez en format standard A4 ou ordonnance A5.</w:t>
+      </w:r>
+    </w:p>
+    <w:p>
+      <w:pPr>
+        <w:spacing w:after="110" w:before="90" w:line="280"/>
+        <w:ind w:left="360"/>
+      </w:pPr>
+      <w:r>
+        <w:rPr>
+          <w:rFonts w:ascii="Segoe UI" w:cs="Segoe UI" w:eastAsia="Segoe UI" w:hAnsi="Segoe UI"/>
+          <w:b/>
+          <w:bCs/>
+          <w:color w:val="1D4ED8"/>
+          <w:sz w:val="22"/>
+          <w:szCs w:val="22"/>
+        </w:rPr>
+        <w:t xml:space="preserve">Étape 3 : Renouvellement en 1 clic — </w:t>
+      </w:r>
+      <w:r>
+        <w:rPr>
+          <w:rFonts w:ascii="Segoe UI" w:cs="Segoe UI" w:eastAsia="Segoe UI" w:hAnsi="Segoe UI"/>
+          <w:color w:val="334155"/>
+          <w:sz w:val="22"/>
+          <w:szCs w:val="22"/>
+        </w:rPr>
+        <w:t xml:space="preserve">Pour un patient chronique, cliquez sur « Renouveler / Dupliquer » : le traitement précédent est rechargé instantanément.</w:t>
       </w:r>
     </w:p>
     <w:tbl>
@@ -1976,7 +2195,7 @@
                 <w:sz w:val="20"/>
                 <w:szCs w:val="20"/>
               </w:rPr>
-              <w:t xml:space="preserve">📷 [Capture d'écran : Formulaire de consultation avec bouton de dictée vocale intelligente]</w:t>
+              <w:t xml:space="preserve">📷 [Capture d'écran : Ordonnance imprimable haute définition avec QR Code de validation et cachet de la structure]</w:t>
             </w:r>
           </w:p>
           <w:p>
@@ -2013,7 +2232,7 @@
         <w:spacing w:after="220" w:before="460"/>
       </w:pPr>
       <w:r>
-        <w:t xml:space="preserve">5. Ordonnances Médicales Sécurisées &amp; Anti-Fraude</w:t>
+        <w:t xml:space="preserve">6. Analyses Médicales, Imagerie &amp; Numérisation (Scans)</w:t>
       </w:r>
     </w:p>
     <w:p>
@@ -2022,23 +2241,23 @@
         <w:spacing w:after="140" w:before="320"/>
       </w:pPr>
       <w:r>
-        <w:t xml:space="preserve">5.1. Objectifs &amp; Utilité</w:t>
-      </w:r>
-    </w:p>
-    <w:p>
-      <w:pPr>
-        <w:spacing w:after="120" w:line="280"/>
-      </w:pPr>
-      <w:r>
-        <w:rPr>
-          <w:rFonts w:ascii="Segoe UI" w:cs="Segoe UI" w:eastAsia="Segoe UI" w:hAnsi="Segoe UI"/>
-          <w:b w:val="false"/>
-          <w:bCs w:val="false"/>
-          <w:color w:val="1E293B"/>
-          <w:sz w:val="22"/>
-          <w:szCs w:val="22"/>
-        </w:rPr>
-        <w:t xml:space="preserve">Chaque ordonnance émise comporte une empreinte cryptographique de sécurité et un QR code officiel qui protège la clinique contre la contrefaçon de prescriptions.</w:t>
+        <w:t xml:space="preserve">6.1. Numérisation et Archivage Immédiat</w:t>
+      </w:r>
+    </w:p>
+    <w:p>
+      <w:pPr>
+        <w:spacing w:after="120" w:line="280"/>
+      </w:pPr>
+      <w:r>
+        <w:rPr>
+          <w:rFonts w:ascii="Segoe UI" w:cs="Segoe UI" w:eastAsia="Segoe UI" w:hAnsi="Segoe UI"/>
+          <w:b w:val="false"/>
+          <w:bCs w:val="false"/>
+          <w:color w:val="1E293B"/>
+          <w:sz w:val="22"/>
+          <w:szCs w:val="22"/>
+        </w:rPr>
+        <w:t xml:space="preserve">Permet de photographier ou numériser les bilans papier apportés par les patients pour qu'ils soient définitivement conservés dans le dossier numérique.</w:t>
       </w:r>
     </w:p>
     <w:p>
@@ -2047,203 +2266,6 @@
         <w:spacing w:after="140" w:before="320"/>
       </w:pPr>
       <w:r>
-        <w:t xml:space="preserve">5.2. Imprimer et Renouveler une Ordonnance</w:t>
-      </w:r>
-    </w:p>
-    <w:p>
-      <w:pPr>
-        <w:spacing w:after="110" w:before="90" w:line="280"/>
-        <w:ind w:left="360"/>
-      </w:pPr>
-      <w:r>
-        <w:rPr>
-          <w:rFonts w:ascii="Segoe UI" w:cs="Segoe UI" w:eastAsia="Segoe UI" w:hAnsi="Segoe UI"/>
-          <w:b/>
-          <w:bCs/>
-          <w:color w:val="1D4ED8"/>
-          <w:sz w:val="22"/>
-          <w:szCs w:val="22"/>
-        </w:rPr>
-        <w:t xml:space="preserve">Étape 1 : Cliquer sur Imprimer — </w:t>
-      </w:r>
-      <w:r>
-        <w:rPr>
-          <w:rFonts w:ascii="Segoe UI" w:cs="Segoe UI" w:eastAsia="Segoe UI" w:hAnsi="Segoe UI"/>
-          <w:color w:val="334155"/>
-          <w:sz w:val="22"/>
-          <w:szCs w:val="22"/>
-        </w:rPr>
-        <w:t xml:space="preserve">Sur l'ordonnance dans le dossier, cliquez sur « Imprimer ». L'ordonnance s'affiche au premier plan.</w:t>
-      </w:r>
-    </w:p>
-    <w:p>
-      <w:pPr>
-        <w:spacing w:after="110" w:before="90" w:line="280"/>
-        <w:ind w:left="360"/>
-      </w:pPr>
-      <w:r>
-        <w:rPr>
-          <w:rFonts w:ascii="Segoe UI" w:cs="Segoe UI" w:eastAsia="Segoe UI" w:hAnsi="Segoe UI"/>
-          <w:b/>
-          <w:bCs/>
-          <w:color w:val="1D4ED8"/>
-          <w:sz w:val="22"/>
-          <w:szCs w:val="22"/>
-        </w:rPr>
-        <w:t xml:space="preserve">Étape 2 : Choisir le format — </w:t>
-      </w:r>
-      <w:r>
-        <w:rPr>
-          <w:rFonts w:ascii="Segoe UI" w:cs="Segoe UI" w:eastAsia="Segoe UI" w:hAnsi="Segoe UI"/>
-          <w:color w:val="334155"/>
-          <w:sz w:val="22"/>
-          <w:szCs w:val="22"/>
-        </w:rPr>
-        <w:t xml:space="preserve">Imprimez en A4 ou A5 sur votre imprimante de cabinet.</w:t>
-      </w:r>
-    </w:p>
-    <w:p>
-      <w:pPr>
-        <w:spacing w:after="110" w:before="90" w:line="280"/>
-        <w:ind w:left="360"/>
-      </w:pPr>
-      <w:r>
-        <w:rPr>
-          <w:rFonts w:ascii="Segoe UI" w:cs="Segoe UI" w:eastAsia="Segoe UI" w:hAnsi="Segoe UI"/>
-          <w:b/>
-          <w:bCs/>
-          <w:color w:val="1D4ED8"/>
-          <w:sz w:val="22"/>
-          <w:szCs w:val="22"/>
-        </w:rPr>
-        <w:t xml:space="preserve">Étape 3 : Renouvellement en 1 clic — </w:t>
-      </w:r>
-      <w:r>
-        <w:rPr>
-          <w:rFonts w:ascii="Segoe UI" w:cs="Segoe UI" w:eastAsia="Segoe UI" w:hAnsi="Segoe UI"/>
-          <w:color w:val="334155"/>
-          <w:sz w:val="22"/>
-          <w:szCs w:val="22"/>
-        </w:rPr>
-        <w:t xml:space="preserve">Pour un patient sous traitement chronique, cliquez sur « Renouveler / Dupliquer » : le traitement précédent est rechargé sans ressaisie.</w:t>
-      </w:r>
-    </w:p>
-    <w:tbl>
-      <w:tblPr>
-        <w:tblW w:type="pct" w:w="100%"/>
-        <w:tblBorders>
-          <w:top w:val="single" w:color="auto" w:sz="4"/>
-          <w:left w:val="single" w:color="auto" w:sz="4"/>
-          <w:bottom w:val="single" w:color="auto" w:sz="4"/>
-          <w:right w:val="single" w:color="auto" w:sz="4"/>
-          <w:insideH w:val="single" w:color="auto" w:sz="4"/>
-          <w:insideV w:val="single" w:color="auto" w:sz="4"/>
-        </w:tblBorders>
-      </w:tblPr>
-      <w:tblGrid>
-        <w:gridCol w:w="100"/>
-      </w:tblGrid>
-      <w:tr>
-        <w:tc>
-          <w:tcPr>
-            <w:tcBorders>
-              <w:top w:val="dashed" w:color="94A3B8" w:sz="6"/>
-              <w:left w:val="dashed" w:color="94A3B8" w:sz="6"/>
-              <w:bottom w:val="dashed" w:color="94A3B8" w:sz="6"/>
-              <w:right w:val="dashed" w:color="94A3B8" w:sz="6"/>
-            </w:tcBorders>
-            <w:shd w:fill="F8FAFC" w:val="clear"/>
-            <w:tcMar>
-              <w:top w:type="dxa" w:w="160"/>
-              <w:left w:type="dxa" w:w="200"/>
-              <w:bottom w:type="dxa" w:w="160"/>
-              <w:right w:type="dxa" w:w="200"/>
-            </w:tcMar>
-          </w:tcPr>
-          <w:p>
-            <w:pPr>
-              <w:jc w:val="center"/>
-            </w:pPr>
-            <w:r>
-              <w:rPr>
-                <w:rFonts w:ascii="Segoe UI" w:cs="Segoe UI" w:eastAsia="Segoe UI" w:hAnsi="Segoe UI"/>
-                <w:b/>
-                <w:bCs/>
-                <w:color w:val="0D2B45"/>
-                <w:sz w:val="20"/>
-                <w:szCs w:val="20"/>
-              </w:rPr>
-              <w:t xml:space="preserve">📷 [Capture d'écran : Ordonnance imprimable haute définition avec QR Code de validation et cachet]</w:t>
-            </w:r>
-          </w:p>
-          <w:p>
-            <w:pPr>
-              <w:spacing w:before="60"/>
-              <w:jc w:val="center"/>
-            </w:pPr>
-            <w:r>
-              <w:rPr>
-                <w:rFonts w:ascii="Segoe UI" w:cs="Segoe UI" w:eastAsia="Segoe UI" w:hAnsi="Segoe UI"/>
-                <w:i/>
-                <w:iCs/>
-                <w:color w:val="64748B"/>
-                <w:sz w:val="18"/>
-                <w:szCs w:val="18"/>
-              </w:rPr>
-              <w:t xml:space="preserve">(Insérer ici la capture d'écran correspondante de l'interface)</w:t>
-            </w:r>
-          </w:p>
-        </w:tc>
-      </w:tr>
-    </w:tbl>
-    <w:p>
-      <w:pPr>
-        <w:pageBreakBefore/>
-      </w:pPr>
-    </w:p>
-    <w:p>
-      <w:pPr>
-        <w:pStyle w:val="Heading1"/>
-        <w:pBdr>
-          <w:bottom w:color="0D2B45" w:sz="18" w:space="6"/>
-        </w:pBdr>
-        <w:spacing w:after="220" w:before="460"/>
-      </w:pPr>
-      <w:r>
-        <w:t xml:space="preserve">6. Analyses Médicales, Imagerie &amp; Numérisation (Scans)</w:t>
-      </w:r>
-    </w:p>
-    <w:p>
-      <w:pPr>
-        <w:pStyle w:val="Heading2"/>
-        <w:spacing w:after="140" w:before="320"/>
-      </w:pPr>
-      <w:r>
-        <w:t xml:space="preserve">6.1. Objectifs &amp; Utilité</w:t>
-      </w:r>
-    </w:p>
-    <w:p>
-      <w:pPr>
-        <w:spacing w:after="120" w:line="280"/>
-      </w:pPr>
-      <w:r>
-        <w:rPr>
-          <w:rFonts w:ascii="Segoe UI" w:cs="Segoe UI" w:eastAsia="Segoe UI" w:hAnsi="Segoe UI"/>
-          <w:b w:val="false"/>
-          <w:bCs w:val="false"/>
-          <w:color w:val="1E293B"/>
-          <w:sz w:val="22"/>
-          <w:szCs w:val="22"/>
-        </w:rPr>
-        <w:t xml:space="preserve">Permet de photographier ou numériser les bilans papier apportés par les patients pour qu'ils ne soient plus jamais perdus.</w:t>
-      </w:r>
-    </w:p>
-    <w:p>
-      <w:pPr>
-        <w:pStyle w:val="Heading2"/>
-        <w:spacing w:after="140" w:before="320"/>
-      </w:pPr>
-      <w:r>
         <w:t xml:space="preserve">6.2. Procédure de numérisation pas-à-pas</w:t>
       </w:r>
     </w:p>
@@ -2322,7 +2344,7 @@
           <w:sz w:val="22"/>
           <w:szCs w:val="22"/>
         </w:rPr>
-        <w:t xml:space="preserve">Cliquez sur « 📁 Choisir un fichier » (PDF/Image jusqu'à 25 Mo) ou sur « 📷 Scanner via Caméra » pour prendre une photo directe du document.</w:t>
+        <w:t xml:space="preserve">Cliquez sur « 📁 Choisir un fichier » (PDF/Image jusqu'à 25 Mo) ou sur « 📷 Scanner via Caméra » pour prendre une photo directe.</w:t>
       </w:r>
     </w:p>
     <w:p>
@@ -2374,7 +2396,7 @@
           <w:sz w:val="22"/>
           <w:szCs w:val="22"/>
         </w:rPr>
-        <w:t xml:space="preserve">Cliquez sur « 👁️ Consulter le Scan » pour ouvrir le document dans la visionneuse plein écran intégrée.</w:t>
+        <w:t xml:space="preserve">Cliquez sur « 👁️ Consulter le Scan » pour ouvrir la visionneuse plein écran intégrée.</w:t>
       </w:r>
     </w:p>
     <w:tbl>
@@ -2468,23 +2490,23 @@
         <w:spacing w:after="140" w:before="320"/>
       </w:pPr>
       <w:r>
-        <w:t xml:space="preserve">7.1. Objectifs &amp; Utilité</w:t>
-      </w:r>
-    </w:p>
-    <w:p>
-      <w:pPr>
-        <w:spacing w:after="120" w:line="280"/>
-      </w:pPr>
-      <w:r>
-        <w:rPr>
-          <w:rFonts w:ascii="Segoe UI" w:cs="Segoe UI" w:eastAsia="Segoe UI" w:hAnsi="Segoe UI"/>
-          <w:b w:val="false"/>
-          <w:bCs w:val="false"/>
-          <w:color w:val="1E293B"/>
-          <w:sz w:val="22"/>
-          <w:szCs w:val="22"/>
-        </w:rPr>
-        <w:t xml:space="preserve">Permet de visualiser instantanément les lits libres et occupés, de gérer les admissions et d'assurer le suivi des séjours.</w:t>
+        <w:t xml:space="preserve">7.1. Suivi des Séjours et Occupation</w:t>
+      </w:r>
+    </w:p>
+    <w:p>
+      <w:pPr>
+        <w:spacing w:after="120" w:line="280"/>
+      </w:pPr>
+      <w:r>
+        <w:rPr>
+          <w:rFonts w:ascii="Segoe UI" w:cs="Segoe UI" w:eastAsia="Segoe UI" w:hAnsi="Segoe UI"/>
+          <w:b w:val="false"/>
+          <w:bCs w:val="false"/>
+          <w:color w:val="1E293B"/>
+          <w:sz w:val="22"/>
+          <w:szCs w:val="22"/>
+        </w:rPr>
+        <w:t xml:space="preserve">Permet de visualiser instantanément les lits libres et occupés, de gérer les admissions et d'assurer le suivi des séjours en temps réel.</w:t>
       </w:r>
     </w:p>
     <w:p>
@@ -2519,7 +2541,7 @@
           <w:sz w:val="22"/>
           <w:szCs w:val="22"/>
         </w:rPr>
-        <w:t xml:space="preserve">Cliquez sur « Hospitalisation » dans le menu.</w:t>
+        <w:t xml:space="preserve">Cliquez sur « Hospitalisation » dans le menu vertical.</w:t>
       </w:r>
     </w:p>
     <w:p>
@@ -2691,23 +2713,23 @@
         <w:spacing w:after="140" w:before="320"/>
       </w:pPr>
       <w:r>
-        <w:t xml:space="preserve">8.1. Objectifs &amp; Utilité</w:t>
-      </w:r>
-    </w:p>
-    <w:p>
-      <w:pPr>
-        <w:spacing w:after="120" w:line="280"/>
-      </w:pPr>
-      <w:r>
-        <w:rPr>
-          <w:rFonts w:ascii="Segoe UI" w:cs="Segoe UI" w:eastAsia="Segoe UI" w:hAnsi="Segoe UI"/>
-          <w:b w:val="false"/>
-          <w:bCs w:val="false"/>
-          <w:color w:val="1E293B"/>
-          <w:sz w:val="22"/>
-          <w:szCs w:val="22"/>
-        </w:rPr>
-        <w:t xml:space="preserve">Calcule automatiquement la part prise en charge par l'IPM et la part restant due par le patient (ticket modérateur), réduisant à zéro les erreurs de calcul.</w:t>
+        <w:t xml:space="preserve">8.1. Calcul Automatique Part Patient &amp; Part IPM</w:t>
+      </w:r>
+    </w:p>
+    <w:p>
+      <w:pPr>
+        <w:spacing w:after="120" w:line="280"/>
+      </w:pPr>
+      <w:r>
+        <w:rPr>
+          <w:rFonts w:ascii="Segoe UI" w:cs="Segoe UI" w:eastAsia="Segoe UI" w:hAnsi="Segoe UI"/>
+          <w:b w:val="false"/>
+          <w:bCs w:val="false"/>
+          <w:color w:val="1E293B"/>
+          <w:sz w:val="22"/>
+          <w:szCs w:val="22"/>
+        </w:rPr>
+        <w:t xml:space="preserve">Calcule automatiquement la part prise en charge par l'organisme payeur et la part restant due par le patient (ticket modérateur), éliminant tout risque d'erreur humaine.</w:t>
       </w:r>
     </w:p>
     <w:p>
@@ -2742,7 +2764,7 @@
           <w:sz w:val="22"/>
           <w:szCs w:val="22"/>
         </w:rPr>
-        <w:t xml:space="preserve">Saisissez le montant en caisse au démarrage le matin.</w:t>
+        <w:t xml:space="preserve">Saisissez le fond de caisse au démarrage le matin.</w:t>
       </w:r>
     </w:p>
     <w:p>
@@ -2768,7 +2790,7 @@
           <w:sz w:val="22"/>
           <w:szCs w:val="22"/>
         </w:rPr>
-        <w:t xml:space="preserve">Si le patient a une IPM, le système applique directement son taux de couverture (ex : 80%).</w:t>
+        <w:t xml:space="preserve">Le système applique directement son taux de couverture IPM (ex : 80%).</w:t>
       </w:r>
     </w:p>
     <w:p>
@@ -2820,7 +2842,7 @@
           <w:sz w:val="22"/>
           <w:szCs w:val="22"/>
         </w:rPr>
-        <w:t xml:space="preserve">Sélectionnez le mode de paiement (Espèces, Wave, Orange Money, Chèque) et enregistrez.</w:t>
+        <w:t xml:space="preserve">Sélectionnez le mode de paiement (Espèces, Wave, Orange Money, Chèque) et validez.</w:t>
       </w:r>
     </w:p>
     <w:p>
@@ -2846,7 +2868,7 @@
           <w:sz w:val="22"/>
           <w:szCs w:val="22"/>
         </w:rPr>
-        <w:t xml:space="preserve">Imprimez la « Facture Patient » pour le reçu ou la « Facture IPM » pour le remboursement.</w:t>
+        <w:t xml:space="preserve">Imprimez la « Facture Patient » ou la « Facture IPM » pour le remboursement.</w:t>
       </w:r>
     </w:p>
     <w:tbl>
@@ -2940,7 +2962,7 @@
         <w:spacing w:after="140" w:before="320"/>
       </w:pPr>
       <w:r>
-        <w:t xml:space="preserve">9.1. Objectifs &amp; Utilité</w:t>
+        <w:t xml:space="preserve">9.1. Transmission Dématérialisée et Sécurisée</w:t>
       </w:r>
     </w:p>
     <w:p>
@@ -2991,7 +3013,7 @@
           <w:sz w:val="22"/>
           <w:szCs w:val="22"/>
         </w:rPr>
-        <w:t xml:space="preserve">Sur la facture, cliquez sur le bouton bleu « ✉️ Mail » ou « Envoyer par Mail ».</w:t>
+        <w:t xml:space="preserve">Sur la facture, cliquez sur le bouton bleu « ✉️ Mail ».</w:t>
       </w:r>
     </w:p>
     <w:p>
@@ -3017,7 +3039,7 @@
           <w:sz w:val="22"/>
           <w:szCs w:val="22"/>
         </w:rPr>
-        <w:t xml:space="preserve">Cliquez sur « 👤 Patient » ou « 🏢 IPM / Assurance » : l'email et l'objet officiel se remplissent automatiquement.</w:t>
+        <w:t xml:space="preserve">Cliquez sur « 👤 Patient » ou « 🏢 IPM / Assurance » : l'adresse email se remplit automatiquement.</w:t>
       </w:r>
     </w:p>
     <w:p>
@@ -3043,7 +3065,7 @@
           <w:sz w:val="22"/>
           <w:szCs w:val="22"/>
         </w:rPr>
-        <w:t xml:space="preserve">Choisissez l'adresse email de votre clinique (ex : Service Facturation).</w:t>
+        <w:t xml:space="preserve">Choisissez l'adresse email officielle de votre structure sanitaire.</w:t>
       </w:r>
     </w:p>
     <w:p>
@@ -3069,50 +3091,24 @@
           <w:sz w:val="22"/>
           <w:szCs w:val="22"/>
         </w:rPr>
-        <w:t xml:space="preserve">Cochez la facture, les ordonnances et les scans d'analyses du dossier.</w:t>
-      </w:r>
-    </w:p>
-    <w:p>
-      <w:pPr>
-        <w:spacing w:after="110" w:before="90" w:line="280"/>
-        <w:ind w:left="360"/>
-      </w:pPr>
-      <w:r>
-        <w:rPr>
-          <w:rFonts w:ascii="Segoe UI" w:cs="Segoe UI" w:eastAsia="Segoe UI" w:hAnsi="Segoe UI"/>
-          <w:b/>
-          <w:bCs/>
-          <w:color w:val="1D4ED8"/>
-          <w:sz w:val="22"/>
-          <w:szCs w:val="22"/>
-        </w:rPr>
-        <w:t xml:space="preserve">Étape 5 : Ajouter un document complémentaire (facultatif) — </w:t>
-      </w:r>
-      <w:r>
-        <w:rPr>
-          <w:rFonts w:ascii="Segoe UI" w:cs="Segoe UI" w:eastAsia="Segoe UI" w:hAnsi="Segoe UI"/>
-          <w:color w:val="334155"/>
-          <w:sz w:val="22"/>
-          <w:szCs w:val="22"/>
-        </w:rPr>
-        <w:t xml:space="preserve">Téléversez un bon de prise en charge avec « + Uploader Fichier / Scan ».</w:t>
-      </w:r>
-    </w:p>
-    <w:p>
-      <w:pPr>
-        <w:spacing w:after="110" w:before="90" w:line="280"/>
-        <w:ind w:left="360"/>
-      </w:pPr>
-      <w:r>
-        <w:rPr>
-          <w:rFonts w:ascii="Segoe UI" w:cs="Segoe UI" w:eastAsia="Segoe UI" w:hAnsi="Segoe UI"/>
-          <w:b/>
-          <w:bCs/>
-          <w:color w:val="1D4ED8"/>
-          <w:sz w:val="22"/>
-          <w:szCs w:val="22"/>
-        </w:rPr>
-        <w:t xml:space="preserve">Étape 6 : Envoyer — </w:t>
+        <w:t xml:space="preserve">Cochez la facture, les ordonnances et les scans d'analyses.</w:t>
+      </w:r>
+    </w:p>
+    <w:p>
+      <w:pPr>
+        <w:spacing w:after="110" w:before="90" w:line="280"/>
+        <w:ind w:left="360"/>
+      </w:pPr>
+      <w:r>
+        <w:rPr>
+          <w:rFonts w:ascii="Segoe UI" w:cs="Segoe UI" w:eastAsia="Segoe UI" w:hAnsi="Segoe UI"/>
+          <w:b/>
+          <w:bCs/>
+          <w:color w:val="1D4ED8"/>
+          <w:sz w:val="22"/>
+          <w:szCs w:val="22"/>
+        </w:rPr>
+        <w:t xml:space="preserve">Étape 5 : Envoyer — </w:t>
       </w:r>
       <w:r>
         <w:rPr>
@@ -3215,23 +3211,23 @@
         <w:spacing w:after="140" w:before="320"/>
       </w:pPr>
       <w:r>
-        <w:t xml:space="preserve">10.1. Objectifs &amp; Utilité</w:t>
-      </w:r>
-    </w:p>
-    <w:p>
-      <w:pPr>
-        <w:spacing w:after="120" w:line="280"/>
-      </w:pPr>
-      <w:r>
-        <w:rPr>
-          <w:rFonts w:ascii="Segoe UI" w:cs="Segoe UI" w:eastAsia="Segoe UI" w:hAnsi="Segoe UI"/>
-          <w:b w:val="false"/>
-          <w:bCs w:val="false"/>
-          <w:color w:val="1E293B"/>
-          <w:sz w:val="22"/>
-          <w:szCs w:val="22"/>
-        </w:rPr>
-        <w:t xml:space="preserve">Contrôle les stocks de médicaments, avertit des risques de péremption et décompte automatiquement les consommables utilisés.</w:t>
+        <w:t xml:space="preserve">10.1. Contrôle des Stocks et Alertes Péremption</w:t>
+      </w:r>
+    </w:p>
+    <w:p>
+      <w:pPr>
+        <w:spacing w:after="120" w:line="280"/>
+      </w:pPr>
+      <w:r>
+        <w:rPr>
+          <w:rFonts w:ascii="Segoe UI" w:cs="Segoe UI" w:eastAsia="Segoe UI" w:hAnsi="Segoe UI"/>
+          <w:b w:val="false"/>
+          <w:bCs w:val="false"/>
+          <w:color w:val="1E293B"/>
+          <w:sz w:val="22"/>
+          <w:szCs w:val="22"/>
+        </w:rPr>
+        <w:t xml:space="preserve">Contrôle les stocks de médicaments en temps réel, alerte sur les risques de péremption et décompte automatiquement les produits prescrits.</w:t>
       </w:r>
     </w:p>
     <w:p>
@@ -3344,7 +3340,7 @@
           <w:sz w:val="22"/>
           <w:szCs w:val="22"/>
         </w:rPr>
-        <w:t xml:space="preserve">Consultez la liste des produits en rouge pour réapprovisionner.</w:t>
+        <w:t xml:space="preserve">Consultez la liste des produits en rouge pour déclencher le réapprovisionnement.</w:t>
       </w:r>
     </w:p>
     <w:tbl>
@@ -3429,7 +3425,7 @@
         <w:spacing w:after="220" w:before="460"/>
       </w:pPr>
       <w:r>
-        <w:t xml:space="preserve">11. Structure Médicale, Praticiens &amp; Spécialités</w:t>
+        <w:t xml:space="preserve">11. Structure Sanitaire, Praticiens &amp; Spécialités</w:t>
       </w:r>
     </w:p>
     <w:p>
@@ -3438,23 +3434,23 @@
         <w:spacing w:after="140" w:before="320"/>
       </w:pPr>
       <w:r>
-        <w:t xml:space="preserve">11.1. Objectifs &amp; Utilité</w:t>
-      </w:r>
-    </w:p>
-    <w:p>
-      <w:pPr>
-        <w:spacing w:after="120" w:line="280"/>
-      </w:pPr>
-      <w:r>
-        <w:rPr>
-          <w:rFonts w:ascii="Segoe UI" w:cs="Segoe UI" w:eastAsia="Segoe UI" w:hAnsi="Segoe UI"/>
-          <w:b w:val="false"/>
-          <w:bCs w:val="false"/>
-          <w:color w:val="1E293B"/>
-          <w:sz w:val="22"/>
-          <w:szCs w:val="22"/>
-        </w:rPr>
-        <w:t xml:space="preserve">Permet de gérer l'équipe médicale, les spécialités, les tarifs conventionnés et les plannings d'intervention.</w:t>
+        <w:t xml:space="preserve">11.1. Gestion de l'Équipe Médicale &amp; Pôles</w:t>
+      </w:r>
+    </w:p>
+    <w:p>
+      <w:pPr>
+        <w:spacing w:after="120" w:line="280"/>
+      </w:pPr>
+      <w:r>
+        <w:rPr>
+          <w:rFonts w:ascii="Segoe UI" w:cs="Segoe UI" w:eastAsia="Segoe UI" w:hAnsi="Segoe UI"/>
+          <w:b w:val="false"/>
+          <w:bCs w:val="false"/>
+          <w:color w:val="1E293B"/>
+          <w:sz w:val="22"/>
+          <w:szCs w:val="22"/>
+        </w:rPr>
+        <w:t xml:space="preserve">Permet de gérer l'ensemble des médecins, les spécialités médicales, les tarifs de consultation et les rattachements départementaux.</w:t>
       </w:r>
     </w:p>
     <w:p>
@@ -3480,7 +3476,7 @@
           <w:sz w:val="22"/>
           <w:szCs w:val="22"/>
         </w:rPr>
-        <w:t xml:space="preserve">Étape 1 : Aller dans Structure &amp; Équipe Médicale — </w:t>
+        <w:t xml:space="preserve">Étape 1 : Aller dans Structure Sanitaire — </w:t>
       </w:r>
       <w:r>
         <w:rPr>
@@ -3506,16 +3502,16 @@
           <w:sz w:val="22"/>
           <w:szCs w:val="22"/>
         </w:rPr>
-        <w:t xml:space="preserve">Étape 2 : Ajouter un médecin — </w:t>
-      </w:r>
-      <w:r>
-        <w:rPr>
-          <w:rFonts w:ascii="Segoe UI" w:cs="Segoe UI" w:eastAsia="Segoe UI" w:hAnsi="Segoe UI"/>
-          <w:color w:val="334155"/>
-          <w:sz w:val="22"/>
-          <w:szCs w:val="22"/>
-        </w:rPr>
-        <w:t xml:space="preserve">Renseignez son nom, sa spécialité, son tarif de consultation et ses coordonnées.</w:t>
+        <w:t xml:space="preserve">Étape 2 : Ajouter un praticien — </w:t>
+      </w:r>
+      <w:r>
+        <w:rPr>
+          <w:rFonts w:ascii="Segoe UI" w:cs="Segoe UI" w:eastAsia="Segoe UI" w:hAnsi="Segoe UI"/>
+          <w:color w:val="334155"/>
+          <w:sz w:val="22"/>
+          <w:szCs w:val="22"/>
+        </w:rPr>
+        <w:t xml:space="preserve">Renseignez son titre (Pr, Dr), prénom, nom, spécialité, tarif de consultation et statut (Interne / Externe).</w:t>
       </w:r>
     </w:p>
     <w:p>
@@ -3626,7 +3622,7 @@
         <w:spacing w:after="220" w:before="460"/>
       </w:pPr>
       <w:r>
-        <w:t xml:space="preserve">12. Administration, Droits d'Accès &amp; Comptes SMTP</w:t>
+        <w:t xml:space="preserve">12. Intelligence Artificielle Médicale &amp; Moteurs LLM Multi-Fournisseurs</w:t>
       </w:r>
     </w:p>
     <w:p>
@@ -3635,23 +3631,331 @@
         <w:spacing w:after="140" w:before="320"/>
       </w:pPr>
       <w:r>
-        <w:t xml:space="preserve">12.1. Gestion des Utilisateurs &amp; Matrice des Droits (RBAC)</w:t>
-      </w:r>
-    </w:p>
-    <w:p>
-      <w:pPr>
-        <w:spacing w:after="120" w:line="280"/>
-      </w:pPr>
-      <w:r>
-        <w:rPr>
-          <w:rFonts w:ascii="Segoe UI" w:cs="Segoe UI" w:eastAsia="Segoe UI" w:hAnsi="Segoe UI"/>
-          <w:b w:val="false"/>
-          <w:bCs w:val="false"/>
-          <w:color w:val="1E293B"/>
-          <w:sz w:val="22"/>
-          <w:szCs w:val="22"/>
-        </w:rPr>
-        <w:t xml:space="preserve">Dans « Paramètres &amp; Configuration », les administrateurs peuvent créer les comptes d'accès et définir précisément les droits de chaque collaborateur (Voir, Créer, Modifier, Supprimer) module par module.</w:t>
+        <w:t xml:space="preserve">12.1. Moteur IA Multi-Fournisseurs Universel</w:t>
+      </w:r>
+    </w:p>
+    <w:p>
+      <w:pPr>
+        <w:spacing w:after="120" w:line="280"/>
+      </w:pPr>
+      <w:r>
+        <w:rPr>
+          <w:rFonts w:ascii="Segoe UI" w:cs="Segoe UI" w:eastAsia="Segoe UI" w:hAnsi="Segoe UI"/>
+          <w:b w:val="false"/>
+          <w:bCs w:val="false"/>
+          <w:color w:val="1E293B"/>
+          <w:sz w:val="22"/>
+          <w:szCs w:val="22"/>
+        </w:rPr>
+        <w:t xml:space="preserve">SoftMed intègre une architecture flexible permettant d'activer le modèle d'IA de votre choix en 1 clic grâce à votre propre clé API :</w:t>
+      </w:r>
+    </w:p>
+    <w:p>
+      <w:pPr>
+        <w:spacing w:after="120" w:line="280"/>
+      </w:pPr>
+      <w:r>
+        <w:rPr>
+          <w:rFonts w:ascii="Segoe UI" w:cs="Segoe UI" w:eastAsia="Segoe UI" w:hAnsi="Segoe UI"/>
+          <w:b w:val="false"/>
+          <w:bCs w:val="false"/>
+          <w:color w:val="1E293B"/>
+          <w:sz w:val="22"/>
+          <w:szCs w:val="22"/>
+        </w:rPr>
+        <w:t xml:space="preserve">• ✨ AIML API (api.aimlapi.com) : Accès à +200 modèles ultra-performants.</w:t>
+      </w:r>
+    </w:p>
+    <w:p>
+      <w:pPr>
+        <w:spacing w:after="120" w:line="280"/>
+      </w:pPr>
+      <w:r>
+        <w:rPr>
+          <w:rFonts w:ascii="Segoe UI" w:cs="Segoe UI" w:eastAsia="Segoe UI" w:hAnsi="Segoe UI"/>
+          <w:b w:val="false"/>
+          <w:bCs w:val="false"/>
+          <w:color w:val="1E293B"/>
+          <w:sz w:val="22"/>
+          <w:szCs w:val="22"/>
+        </w:rPr>
+        <w:t xml:space="preserve">• 🌐 OpenRouter : Accès universel (DeepSeek-V3, Claude 3.5 Sonnet, GPT-4o...).</w:t>
+      </w:r>
+    </w:p>
+    <w:p>
+      <w:pPr>
+        <w:spacing w:after="120" w:line="280"/>
+      </w:pPr>
+      <w:r>
+        <w:rPr>
+          <w:rFonts w:ascii="Segoe UI" w:cs="Segoe UI" w:eastAsia="Segoe UI" w:hAnsi="Segoe UI"/>
+          <w:b w:val="false"/>
+          <w:bCs w:val="false"/>
+          <w:color w:val="1E293B"/>
+          <w:sz w:val="22"/>
+          <w:szCs w:val="22"/>
+        </w:rPr>
+        <w:t xml:space="preserve">• 🧠 Google Gemini : Gemini 2.0 Flash / Pro avec clé Google AI Studio.</w:t>
+      </w:r>
+    </w:p>
+    <w:p>
+      <w:pPr>
+        <w:spacing w:after="120" w:line="280"/>
+      </w:pPr>
+      <w:r>
+        <w:rPr>
+          <w:rFonts w:ascii="Segoe UI" w:cs="Segoe UI" w:eastAsia="Segoe UI" w:hAnsi="Segoe UI"/>
+          <w:b w:val="false"/>
+          <w:bCs w:val="false"/>
+          <w:color w:val="1E293B"/>
+          <w:sz w:val="22"/>
+          <w:szCs w:val="22"/>
+        </w:rPr>
+        <w:t xml:space="preserve">• 🦙 DeepSeek Direct &amp; Anthropic Claude Direct.</w:t>
+      </w:r>
+    </w:p>
+    <w:p>
+      <w:pPr>
+        <w:spacing w:after="120" w:line="280"/>
+      </w:pPr>
+      <w:r>
+        <w:rPr>
+          <w:rFonts w:ascii="Segoe UI" w:cs="Segoe UI" w:eastAsia="Segoe UI" w:hAnsi="Segoe UI"/>
+          <w:b w:val="false"/>
+          <w:bCs w:val="false"/>
+          <w:color w:val="1E293B"/>
+          <w:sz w:val="22"/>
+          <w:szCs w:val="22"/>
+        </w:rPr>
+        <w:t xml:space="preserve">• 💻 Mammouth IA &amp; Ollama Local (100% Hors-ligne pour la souveraineté des données).</w:t>
+      </w:r>
+    </w:p>
+    <w:p>
+      <w:pPr>
+        <w:pStyle w:val="Heading2"/>
+        <w:spacing w:after="140" w:before="320"/>
+      </w:pPr>
+      <w:r>
+        <w:t xml:space="preserve">12.2. Configuration &amp; Test de Liaison en Direct</w:t>
+      </w:r>
+    </w:p>
+    <w:p>
+      <w:pPr>
+        <w:spacing w:after="110" w:before="90" w:line="280"/>
+        <w:ind w:left="360"/>
+      </w:pPr>
+      <w:r>
+        <w:rPr>
+          <w:rFonts w:ascii="Segoe UI" w:cs="Segoe UI" w:eastAsia="Segoe UI" w:hAnsi="Segoe UI"/>
+          <w:b/>
+          <w:bCs/>
+          <w:color w:val="1D4ED8"/>
+          <w:sz w:val="22"/>
+          <w:szCs w:val="22"/>
+        </w:rPr>
+        <w:t xml:space="preserve">Étape 1 : Ouvrir Paramètres &amp; Configuration — </w:t>
+      </w:r>
+      <w:r>
+        <w:rPr>
+          <w:rFonts w:ascii="Segoe UI" w:cs="Segoe UI" w:eastAsia="Segoe UI" w:hAnsi="Segoe UI"/>
+          <w:color w:val="334155"/>
+          <w:sz w:val="22"/>
+          <w:szCs w:val="22"/>
+        </w:rPr>
+        <w:t xml:space="preserve">Cliquez sur « Paramètres &amp; Configuration » puis descendez à la section « 🤖 Intelligence Artificielle Médicale &amp; LLM ».</w:t>
+      </w:r>
+    </w:p>
+    <w:p>
+      <w:pPr>
+        <w:spacing w:after="110" w:before="90" w:line="280"/>
+        <w:ind w:left="360"/>
+      </w:pPr>
+      <w:r>
+        <w:rPr>
+          <w:rFonts w:ascii="Segoe UI" w:cs="Segoe UI" w:eastAsia="Segoe UI" w:hAnsi="Segoe UI"/>
+          <w:b/>
+          <w:bCs/>
+          <w:color w:val="1D4ED8"/>
+          <w:sz w:val="22"/>
+          <w:szCs w:val="22"/>
+        </w:rPr>
+        <w:t xml:space="preserve">Étape 2 : Choisir un Fournisseur — </w:t>
+      </w:r>
+      <w:r>
+        <w:rPr>
+          <w:rFonts w:ascii="Segoe UI" w:cs="Segoe UI" w:eastAsia="Segoe UI" w:hAnsi="Segoe UI"/>
+          <w:color w:val="334155"/>
+          <w:sz w:val="22"/>
+          <w:szCs w:val="22"/>
+        </w:rPr>
+        <w:t xml:space="preserve">Cliquez sur l'un des boutons préréglés (AIML API, OpenRouter, Gemini...).</w:t>
+      </w:r>
+    </w:p>
+    <w:p>
+      <w:pPr>
+        <w:spacing w:after="110" w:before="90" w:line="280"/>
+        <w:ind w:left="360"/>
+      </w:pPr>
+      <w:r>
+        <w:rPr>
+          <w:rFonts w:ascii="Segoe UI" w:cs="Segoe UI" w:eastAsia="Segoe UI" w:hAnsi="Segoe UI"/>
+          <w:b/>
+          <w:bCs/>
+          <w:color w:val="1D4ED8"/>
+          <w:sz w:val="22"/>
+          <w:szCs w:val="22"/>
+        </w:rPr>
+        <w:t xml:space="preserve">Étape 3 : Saisir la Clé API — </w:t>
+      </w:r>
+      <w:r>
+        <w:rPr>
+          <w:rFonts w:ascii="Segoe UI" w:cs="Segoe UI" w:eastAsia="Segoe UI" w:hAnsi="Segoe UI"/>
+          <w:color w:val="334155"/>
+          <w:sz w:val="22"/>
+          <w:szCs w:val="22"/>
+        </w:rPr>
+        <w:t xml:space="preserve">Collez votre clé API secrète.</w:t>
+      </w:r>
+    </w:p>
+    <w:p>
+      <w:pPr>
+        <w:spacing w:after="110" w:before="90" w:line="280"/>
+        <w:ind w:left="360"/>
+      </w:pPr>
+      <w:r>
+        <w:rPr>
+          <w:rFonts w:ascii="Segoe UI" w:cs="Segoe UI" w:eastAsia="Segoe UI" w:hAnsi="Segoe UI"/>
+          <w:b/>
+          <w:bCs/>
+          <w:color w:val="1D4ED8"/>
+          <w:sz w:val="22"/>
+          <w:szCs w:val="22"/>
+        </w:rPr>
+        <w:t xml:space="preserve">Étape 4 : Tester la Connexion — </w:t>
+      </w:r>
+      <w:r>
+        <w:rPr>
+          <w:rFonts w:ascii="Segoe UI" w:cs="Segoe UI" w:eastAsia="Segoe UI" w:hAnsi="Segoe UI"/>
+          <w:color w:val="334155"/>
+          <w:sz w:val="22"/>
+          <w:szCs w:val="22"/>
+        </w:rPr>
+        <w:t xml:space="preserve">Cliquez sur « ⚡ Tester la Connexion » : le système mesure la latence et confirme la réponse du modèle.</w:t>
+      </w:r>
+    </w:p>
+    <w:p>
+      <w:pPr>
+        <w:spacing w:after="110" w:before="90" w:line="280"/>
+        <w:ind w:left="360"/>
+      </w:pPr>
+      <w:r>
+        <w:rPr>
+          <w:rFonts w:ascii="Segoe UI" w:cs="Segoe UI" w:eastAsia="Segoe UI" w:hAnsi="Segoe UI"/>
+          <w:b/>
+          <w:bCs/>
+          <w:color w:val="1D4ED8"/>
+          <w:sz w:val="22"/>
+          <w:szCs w:val="22"/>
+        </w:rPr>
+        <w:t xml:space="preserve">Étape 5 : Activer ou Désactiver — </w:t>
+      </w:r>
+      <w:r>
+        <w:rPr>
+          <w:rFonts w:ascii="Segoe UI" w:cs="Segoe UI" w:eastAsia="Segoe UI" w:hAnsi="Segoe UI"/>
+          <w:color w:val="334155"/>
+          <w:sz w:val="22"/>
+          <w:szCs w:val="22"/>
+        </w:rPr>
+        <w:t xml:space="preserve">Utilisez le commutateur pour activer ou désactiver l'IA à la demande.</w:t>
+      </w:r>
+    </w:p>
+    <w:p>
+      <w:pPr>
+        <w:pStyle w:val="Heading2"/>
+        <w:spacing w:after="140" w:before="320"/>
+      </w:pPr>
+      <w:r>
+        <w:t xml:space="preserve">12.3. Agent Vocal Interactif avec Vérification &amp; Correction</w:t>
+      </w:r>
+    </w:p>
+    <w:p>
+      <w:pPr>
+        <w:spacing w:after="120" w:line="280"/>
+      </w:pPr>
+      <w:r>
+        <w:rPr>
+          <w:rFonts w:ascii="Segoe UI" w:cs="Segoe UI" w:eastAsia="Segoe UI" w:hAnsi="Segoe UI"/>
+          <w:b w:val="false"/>
+          <w:bCs w:val="false"/>
+          <w:color w:val="1E293B"/>
+          <w:sz w:val="22"/>
+          <w:szCs w:val="22"/>
+        </w:rPr>
+        <w:t xml:space="preserve">L'Agent Vocal de prise de rendez-vous applique un protocole d'écoute et de dialogue interactif sécurisé :</w:t>
+      </w:r>
+    </w:p>
+    <w:p>
+      <w:pPr>
+        <w:spacing w:after="120" w:line="280"/>
+      </w:pPr>
+      <w:r>
+        <w:rPr>
+          <w:rFonts w:ascii="Segoe UI" w:cs="Segoe UI" w:eastAsia="Segoe UI" w:hAnsi="Segoe UI"/>
+          <w:b w:val="false"/>
+          <w:bCs w:val="false"/>
+          <w:color w:val="1E293B"/>
+          <w:sz w:val="22"/>
+          <w:szCs w:val="22"/>
+        </w:rPr>
+        <w:t xml:space="preserve">1. Recueil des informations (code patient, médecin, spécialité, motif de consultation, jour et heure).</w:t>
+      </w:r>
+    </w:p>
+    <w:p>
+      <w:pPr>
+        <w:spacing w:after="120" w:line="280"/>
+      </w:pPr>
+      <w:r>
+        <w:rPr>
+          <w:rFonts w:ascii="Segoe UI" w:cs="Segoe UI" w:eastAsia="Segoe UI" w:hAnsi="Segoe UI"/>
+          <w:b w:val="false"/>
+          <w:bCs w:val="false"/>
+          <w:color w:val="1E293B"/>
+          <w:sz w:val="22"/>
+          <w:szCs w:val="22"/>
+        </w:rPr>
+        <w:t xml:space="preserve">2. Récapitulatif à voix haute par l'assistant vocal.</w:t>
+      </w:r>
+    </w:p>
+    <w:p>
+      <w:pPr>
+        <w:spacing w:after="120" w:line="280"/>
+      </w:pPr>
+      <w:r>
+        <w:rPr>
+          <w:rFonts w:ascii="Segoe UI" w:cs="Segoe UI" w:eastAsia="Segoe UI" w:hAnsi="Segoe UI"/>
+          <w:b w:val="false"/>
+          <w:bCs w:val="false"/>
+          <w:color w:val="1E293B"/>
+          <w:sz w:val="22"/>
+          <w:szCs w:val="22"/>
+        </w:rPr>
+        <w:t xml:space="preserve">3. Boucle de validation/correction continue : le patient peut modifier vocalement l'heure, le médecin ou le motif jusqu'à confirmation explicite (« Oui »).</w:t>
+      </w:r>
+    </w:p>
+    <w:p>
+      <w:pPr>
+        <w:spacing w:after="120" w:line="280"/>
+      </w:pPr>
+      <w:r>
+        <w:rPr>
+          <w:rFonts w:ascii="Segoe UI" w:cs="Segoe UI" w:eastAsia="Segoe UI" w:hAnsi="Segoe UI"/>
+          <w:b w:val="false"/>
+          <w:bCs w:val="false"/>
+          <w:color w:val="1E293B"/>
+          <w:sz w:val="22"/>
+          <w:szCs w:val="22"/>
+        </w:rPr>
+        <w:t xml:space="preserve">4. Enregistrement instantané et génération du pass numérique.</w:t>
       </w:r>
     </w:p>
     <w:tbl>
@@ -3699,7 +4003,7 @@
                 <w:sz w:val="20"/>
                 <w:szCs w:val="20"/>
               </w:rPr>
-              <w:t xml:space="preserve">📷 [Capture d'écran : Matrice fine des permissions d'accès par utilisateur et par module]</w:t>
+              <w:t xml:space="preserve">📷 [Capture d'écran : Panneau de configuration IA LLM Multi-Fournisseurs avec test de latence et agent vocal]</w:t>
             </w:r>
           </w:p>
           <w:p>
@@ -3724,44 +4028,70 @@
     </w:tbl>
     <w:p>
       <w:pPr>
+        <w:pageBreakBefore/>
+      </w:pPr>
+    </w:p>
+    <w:p>
+      <w:pPr>
+        <w:pStyle w:val="Heading1"/>
+        <w:pBdr>
+          <w:bottom w:color="0D2B45" w:sz="18" w:space="6"/>
+        </w:pBdr>
+        <w:spacing w:after="220" w:before="460"/>
+      </w:pPr>
+      <w:r>
+        <w:t xml:space="preserve">13. Administration, Droits d'Accès &amp; Comptes SMTP</w:t>
+      </w:r>
+    </w:p>
+    <w:p>
+      <w:pPr>
         <w:pStyle w:val="Heading2"/>
         <w:spacing w:after="140" w:before="320"/>
       </w:pPr>
       <w:r>
-        <w:t xml:space="preserve">12.2. Configuration des Serveurs de Messagerie SMTP (OVH, Gmail, etc.)</w:t>
-      </w:r>
-    </w:p>
-    <w:p>
-      <w:pPr>
-        <w:spacing w:after="120" w:line="280"/>
-      </w:pPr>
-      <w:r>
-        <w:rPr>
-          <w:rFonts w:ascii="Segoe UI" w:cs="Segoe UI" w:eastAsia="Segoe UI" w:hAnsi="Segoe UI"/>
-          <w:b w:val="false"/>
-          <w:bCs w:val="false"/>
-          <w:color w:val="1E293B"/>
-          <w:sz w:val="22"/>
-          <w:szCs w:val="22"/>
-        </w:rPr>
-        <w:t xml:space="preserve">Pour envoyer les factures depuis vos propres adresses emails officielles :</w:t>
-      </w:r>
-    </w:p>
-    <w:p>
-      <w:pPr>
-        <w:spacing w:after="110" w:before="90" w:line="280"/>
-        <w:ind w:left="360"/>
-      </w:pPr>
-      <w:r>
-        <w:rPr>
-          <w:rFonts w:ascii="Segoe UI" w:cs="Segoe UI" w:eastAsia="Segoe UI" w:hAnsi="Segoe UI"/>
-          <w:b/>
-          <w:bCs/>
-          <w:color w:val="1D4ED8"/>
-          <w:sz w:val="22"/>
-          <w:szCs w:val="22"/>
-        </w:rPr>
-        <w:t xml:space="preserve">Étape 1 : Ouvrir Paramètres &amp; Configuration — </w:t>
+        <w:t xml:space="preserve">13.1. Gestion des Utilisateurs &amp; Matrice des Droits (RBAC)</w:t>
+      </w:r>
+    </w:p>
+    <w:p>
+      <w:pPr>
+        <w:spacing w:after="120" w:line="280"/>
+      </w:pPr>
+      <w:r>
+        <w:rPr>
+          <w:rFonts w:ascii="Segoe UI" w:cs="Segoe UI" w:eastAsia="Segoe UI" w:hAnsi="Segoe UI"/>
+          <w:b w:val="false"/>
+          <w:bCs w:val="false"/>
+          <w:color w:val="1E293B"/>
+          <w:sz w:val="22"/>
+          <w:szCs w:val="22"/>
+        </w:rPr>
+        <w:t xml:space="preserve">Dans « Paramètres &amp; Configuration », les administrateurs définissent les profils (Admin / Utilisateur simple) et règlent les droits d'accès (Voir, Créer, Modifier, Supprimer) module par module.</w:t>
+      </w:r>
+    </w:p>
+    <w:p>
+      <w:pPr>
+        <w:pStyle w:val="Heading2"/>
+        <w:spacing w:after="140" w:before="320"/>
+      </w:pPr>
+      <w:r>
+        <w:t xml:space="preserve">13.2. Configuration des Serveurs de Messagerie SMTP (OVH, Gmail, etc.)</w:t>
+      </w:r>
+    </w:p>
+    <w:p>
+      <w:pPr>
+        <w:spacing w:after="110" w:before="90" w:line="280"/>
+        <w:ind w:left="360"/>
+      </w:pPr>
+      <w:r>
+        <w:rPr>
+          <w:rFonts w:ascii="Segoe UI" w:cs="Segoe UI" w:eastAsia="Segoe UI" w:hAnsi="Segoe UI"/>
+          <w:b/>
+          <w:bCs/>
+          <w:color w:val="1D4ED8"/>
+          <w:sz w:val="22"/>
+          <w:szCs w:val="22"/>
+        </w:rPr>
+        <w:t xml:space="preserve">Étape 1 : Ouvrir Paramètres — </w:t>
       </w:r>
       <w:r>
         <w:rPr>
@@ -3813,94 +4143,68 @@
           <w:sz w:val="22"/>
           <w:szCs w:val="22"/>
         </w:rPr>
-        <w:t xml:space="preserve">Étape 3 : Utiliser le préréglage — </w:t>
-      </w:r>
-      <w:r>
-        <w:rPr>
-          <w:rFonts w:ascii="Segoe UI" w:cs="Segoe UI" w:eastAsia="Segoe UI" w:hAnsi="Segoe UI"/>
-          <w:color w:val="334155"/>
-          <w:sz w:val="22"/>
-          <w:szCs w:val="22"/>
-        </w:rPr>
-        <w:t xml:space="preserve">Cliquez sur « OVH Mail » (remplit automatiquement ssl0.ovh.net et le port 465 SSL).</w:t>
-      </w:r>
-    </w:p>
-    <w:p>
-      <w:pPr>
-        <w:spacing w:after="110" w:before="90" w:line="280"/>
-        <w:ind w:left="360"/>
-      </w:pPr>
-      <w:r>
-        <w:rPr>
-          <w:rFonts w:ascii="Segoe UI" w:cs="Segoe UI" w:eastAsia="Segoe UI" w:hAnsi="Segoe UI"/>
-          <w:b/>
-          <w:bCs/>
-          <w:color w:val="1D4ED8"/>
-          <w:sz w:val="22"/>
-          <w:szCs w:val="22"/>
-        </w:rPr>
-        <w:t xml:space="preserve">Étape 4 : Entrer vos identifiants — </w:t>
-      </w:r>
-      <w:r>
-        <w:rPr>
-          <w:rFonts w:ascii="Segoe UI" w:cs="Segoe UI" w:eastAsia="Segoe UI" w:hAnsi="Segoe UI"/>
-          <w:color w:val="334155"/>
-          <w:sz w:val="22"/>
-          <w:szCs w:val="22"/>
-        </w:rPr>
-        <w:t xml:space="preserve">Saisissez votre email complet et votre mot de passe.</w:t>
-      </w:r>
-    </w:p>
-    <w:p>
-      <w:pPr>
-        <w:spacing w:after="110" w:before="90" w:line="280"/>
-        <w:ind w:left="360"/>
-      </w:pPr>
-      <w:r>
-        <w:rPr>
-          <w:rFonts w:ascii="Segoe UI" w:cs="Segoe UI" w:eastAsia="Segoe UI" w:hAnsi="Segoe UI"/>
-          <w:b/>
-          <w:bCs/>
-          <w:color w:val="1D4ED8"/>
-          <w:sz w:val="22"/>
-          <w:szCs w:val="22"/>
-        </w:rPr>
-        <w:t xml:space="preserve">Étape 5 : Tester la connexion — </w:t>
-      </w:r>
-      <w:r>
-        <w:rPr>
-          <w:rFonts w:ascii="Segoe UI" w:cs="Segoe UI" w:eastAsia="Segoe UI" w:hAnsi="Segoe UI"/>
-          <w:color w:val="334155"/>
-          <w:sz w:val="22"/>
-          <w:szCs w:val="22"/>
-        </w:rPr>
-        <w:t xml:space="preserve">Cliquez sur « Test » pour valider la liaison avec le serveur SMTP.</w:t>
-      </w:r>
-    </w:p>
-    <w:p>
-      <w:pPr>
-        <w:spacing w:after="110" w:before="90" w:line="280"/>
-        <w:ind w:left="360"/>
-      </w:pPr>
-      <w:r>
-        <w:rPr>
-          <w:rFonts w:ascii="Segoe UI" w:cs="Segoe UI" w:eastAsia="Segoe UI" w:hAnsi="Segoe UI"/>
-          <w:b/>
-          <w:bCs/>
-          <w:color w:val="1D4ED8"/>
-          <w:sz w:val="22"/>
-          <w:szCs w:val="22"/>
-        </w:rPr>
-        <w:t xml:space="preserve">Étape 6 : Enregistrer — </w:t>
-      </w:r>
-      <w:r>
-        <w:rPr>
-          <w:rFonts w:ascii="Segoe UI" w:cs="Segoe UI" w:eastAsia="Segoe UI" w:hAnsi="Segoe UI"/>
-          <w:color w:val="334155"/>
-          <w:sz w:val="22"/>
-          <w:szCs w:val="22"/>
-        </w:rPr>
-        <w:t xml:space="preserve">Cochez « Définir par défaut » et enregistrez.</w:t>
+        <w:t xml:space="preserve">Étape 3 : Sélectionner le Préréglage — </w:t>
+      </w:r>
+      <w:r>
+        <w:rPr>
+          <w:rFonts w:ascii="Segoe UI" w:cs="Segoe UI" w:eastAsia="Segoe UI" w:hAnsi="Segoe UI"/>
+          <w:color w:val="334155"/>
+          <w:sz w:val="22"/>
+          <w:szCs w:val="22"/>
+        </w:rPr>
+        <w:t xml:space="preserve">Cliquez sur « OVH Mail » (remplit ssl0.ovh.net et port 465 SSL).</w:t>
+      </w:r>
+    </w:p>
+    <w:p>
+      <w:pPr>
+        <w:spacing w:after="110" w:before="90" w:line="280"/>
+        <w:ind w:left="360"/>
+      </w:pPr>
+      <w:r>
+        <w:rPr>
+          <w:rFonts w:ascii="Segoe UI" w:cs="Segoe UI" w:eastAsia="Segoe UI" w:hAnsi="Segoe UI"/>
+          <w:b/>
+          <w:bCs/>
+          <w:color w:val="1D4ED8"/>
+          <w:sz w:val="22"/>
+          <w:szCs w:val="22"/>
+        </w:rPr>
+        <w:t xml:space="preserve">Étape 4 : Saisir les identifiants — </w:t>
+      </w:r>
+      <w:r>
+        <w:rPr>
+          <w:rFonts w:ascii="Segoe UI" w:cs="Segoe UI" w:eastAsia="Segoe UI" w:hAnsi="Segoe UI"/>
+          <w:color w:val="334155"/>
+          <w:sz w:val="22"/>
+          <w:szCs w:val="22"/>
+        </w:rPr>
+        <w:t xml:space="preserve">Entrez l'email complet et le mot de passe de la boîte.</w:t>
+      </w:r>
+    </w:p>
+    <w:p>
+      <w:pPr>
+        <w:spacing w:after="110" w:before="90" w:line="280"/>
+        <w:ind w:left="360"/>
+      </w:pPr>
+      <w:r>
+        <w:rPr>
+          <w:rFonts w:ascii="Segoe UI" w:cs="Segoe UI" w:eastAsia="Segoe UI" w:hAnsi="Segoe UI"/>
+          <w:b/>
+          <w:bCs/>
+          <w:color w:val="1D4ED8"/>
+          <w:sz w:val="22"/>
+          <w:szCs w:val="22"/>
+        </w:rPr>
+        <w:t xml:space="preserve">Étape 5 : Tester et Enregistrer — </w:t>
+      </w:r>
+      <w:r>
+        <w:rPr>
+          <w:rFonts w:ascii="Segoe UI" w:cs="Segoe UI" w:eastAsia="Segoe UI" w:hAnsi="Segoe UI"/>
+          <w:color w:val="334155"/>
+          <w:sz w:val="22"/>
+          <w:szCs w:val="22"/>
+        </w:rPr>
+        <w:t xml:space="preserve">Cliquez sur « Test » pour valider puis enregistrez.</w:t>
       </w:r>
     </w:p>
     <w:tbl>
@@ -3948,7 +4252,7 @@
                 <w:sz w:val="20"/>
                 <w:szCs w:val="20"/>
               </w:rPr>
-              <w:t xml:space="preserve">📷 [Capture d'écran : Formulaire d'ajout de compte SMTP avec bouton de test de connexion en direct]</w:t>
+              <w:t xml:space="preserve">📷 [Capture d'écran : Matrice des droits d'accès et configuration des comptes SMTP]</w:t>
             </w:r>
           </w:p>
           <w:p>
@@ -3985,7 +4289,7 @@
         <w:spacing w:after="220" w:before="460"/>
       </w:pPr>
       <w:r>
-        <w:t xml:space="preserve">13. Fiches Mémo Pratiques par Rôle Métier</w:t>
+        <w:t xml:space="preserve">14. Fiches Mémo Pratiques par Rôle Métier</w:t>
       </w:r>
     </w:p>
     <w:p>
@@ -4010,39 +4314,39 @@
           <w:sz w:val="22"/>
           <w:szCs w:val="22"/>
         </w:rPr>
-        <w:t xml:space="preserve">• Patient entrant : Chercher son nom dans « Patients &amp; DPI ». Créer sa fiche si nouveau.</w:t>
-      </w:r>
-    </w:p>
-    <w:p>
-      <w:pPr>
-        <w:spacing w:after="120" w:line="280"/>
-      </w:pPr>
-      <w:r>
-        <w:rPr>
-          <w:rFonts w:ascii="Segoe UI" w:cs="Segoe UI" w:eastAsia="Segoe UI" w:hAnsi="Segoe UI"/>
-          <w:b w:val="false"/>
-          <w:bCs w:val="false"/>
-          <w:color w:val="1E293B"/>
-          <w:sz w:val="22"/>
-          <w:szCs w:val="22"/>
-        </w:rPr>
-        <w:t xml:space="preserve">• Prise de rendez-vous : Choisir le médecin et le créneau dans « Agenda &amp; RDV ».</w:t>
-      </w:r>
-    </w:p>
-    <w:p>
-      <w:pPr>
-        <w:spacing w:after="120" w:line="280"/>
-      </w:pPr>
-      <w:r>
-        <w:rPr>
-          <w:rFonts w:ascii="Segoe UI" w:cs="Segoe UI" w:eastAsia="Segoe UI" w:hAnsi="Segoe UI"/>
-          <w:b w:val="false"/>
-          <w:bCs w:val="false"/>
-          <w:color w:val="1E293B"/>
-          <w:sz w:val="22"/>
-          <w:szCs w:val="22"/>
-        </w:rPr>
-        <w:t xml:space="preserve">• Orientation : Noter le statut (Ambulatoire / Hospitalisé) et guider le patient.</w:t>
+        <w:t xml:space="preserve">• Accueil Patient : Vérifier le code patient (ex: SM-4821) ou créer la fiche avec son statut (Interne/Externe).</w:t>
+      </w:r>
+    </w:p>
+    <w:p>
+      <w:pPr>
+        <w:spacing w:after="120" w:line="280"/>
+      </w:pPr>
+      <w:r>
+        <w:rPr>
+          <w:rFonts w:ascii="Segoe UI" w:cs="Segoe UI" w:eastAsia="Segoe UI" w:hAnsi="Segoe UI"/>
+          <w:b w:val="false"/>
+          <w:bCs w:val="false"/>
+          <w:color w:val="1E293B"/>
+          <w:sz w:val="22"/>
+          <w:szCs w:val="22"/>
+        </w:rPr>
+        <w:t xml:space="preserve">• Prise de Rendez-vous : Choisir le créneau de 15 min libre (en vert) dans « Agenda &amp; RDV ».</w:t>
+      </w:r>
+    </w:p>
+    <w:p>
+      <w:pPr>
+        <w:spacing w:after="120" w:line="280"/>
+      </w:pPr>
+      <w:r>
+        <w:rPr>
+          <w:rFonts w:ascii="Segoe UI" w:cs="Segoe UI" w:eastAsia="Segoe UI" w:hAnsi="Segoe UI"/>
+          <w:b w:val="false"/>
+          <w:bCs w:val="false"/>
+          <w:color w:val="1E293B"/>
+          <w:sz w:val="22"/>
+          <w:szCs w:val="22"/>
+        </w:rPr>
+        <w:t xml:space="preserve">• Orientation : Transmettre le lien de réservation en ligne ou WhatsApp si le patient le souhaite.</w:t>
       </w:r>
     </w:p>
     <w:p>
@@ -4083,39 +4387,39 @@
           <w:sz w:val="22"/>
           <w:szCs w:val="22"/>
         </w:rPr>
-        <w:t xml:space="preserve">• Saisie : Utiliser le micro « 🎙️ » pour dicter les observations médicales.</w:t>
-      </w:r>
-    </w:p>
-    <w:p>
-      <w:pPr>
-        <w:spacing w:after="120" w:line="280"/>
-      </w:pPr>
-      <w:r>
-        <w:rPr>
-          <w:rFonts w:ascii="Segoe UI" w:cs="Segoe UI" w:eastAsia="Segoe UI" w:hAnsi="Segoe UI"/>
-          <w:b w:val="false"/>
-          <w:bCs w:val="false"/>
-          <w:color w:val="1E293B"/>
-          <w:sz w:val="22"/>
-          <w:szCs w:val="22"/>
-        </w:rPr>
-        <w:t xml:space="preserve">• Ordonnance : Ajouter les médicaments et imprimer l'ordonnance sécurisée avec QR code.</w:t>
-      </w:r>
-    </w:p>
-    <w:p>
-      <w:pPr>
-        <w:spacing w:after="120" w:line="280"/>
-      </w:pPr>
-      <w:r>
-        <w:rPr>
-          <w:rFonts w:ascii="Segoe UI" w:cs="Segoe UI" w:eastAsia="Segoe UI" w:hAnsi="Segoe UI"/>
-          <w:b w:val="false"/>
-          <w:bCs w:val="false"/>
-          <w:color w:val="1E293B"/>
-          <w:sz w:val="22"/>
-          <w:szCs w:val="22"/>
-        </w:rPr>
-        <w:t xml:space="preserve">• Analyses : Consulter l'onglet 3 pour voir les scans des examens de laboratoire.</w:t>
+        <w:t xml:space="preserve">• Dictée Vocale : Utiliser le micro « 🎙️ » pour dicter directement les observations.</w:t>
+      </w:r>
+    </w:p>
+    <w:p>
+      <w:pPr>
+        <w:spacing w:after="120" w:line="280"/>
+      </w:pPr>
+      <w:r>
+        <w:rPr>
+          <w:rFonts w:ascii="Segoe UI" w:cs="Segoe UI" w:eastAsia="Segoe UI" w:hAnsi="Segoe UI"/>
+          <w:b w:val="false"/>
+          <w:bCs w:val="false"/>
+          <w:color w:val="1E293B"/>
+          <w:sz w:val="22"/>
+          <w:szCs w:val="22"/>
+        </w:rPr>
+        <w:t xml:space="preserve">• Copilote IA : Vérifier les interactions médicamenteuses et générer la synthèse clinique.</w:t>
+      </w:r>
+    </w:p>
+    <w:p>
+      <w:pPr>
+        <w:spacing w:after="120" w:line="280"/>
+      </w:pPr>
+      <w:r>
+        <w:rPr>
+          <w:rFonts w:ascii="Segoe UI" w:cs="Segoe UI" w:eastAsia="Segoe UI" w:hAnsi="Segoe UI"/>
+          <w:b w:val="false"/>
+          <w:bCs w:val="false"/>
+          <w:color w:val="1E293B"/>
+          <w:sz w:val="22"/>
+          <w:szCs w:val="22"/>
+        </w:rPr>
+        <w:t xml:space="preserve">• Ordonnance : Valider la prescription avec QR Code sécurisé.</w:t>
       </w:r>
     </w:p>
     <w:p>
@@ -4156,55 +4460,55 @@
           <w:sz w:val="22"/>
           <w:szCs w:val="22"/>
         </w:rPr>
-        <w:t xml:space="preserve">• Facturation : Sélectionner le patient. Le calcul Part Patient / Part IPM est automatique.</w:t>
-      </w:r>
-    </w:p>
-    <w:p>
-      <w:pPr>
-        <w:spacing w:after="120" w:line="280"/>
-      </w:pPr>
-      <w:r>
-        <w:rPr>
-          <w:rFonts w:ascii="Segoe UI" w:cs="Segoe UI" w:eastAsia="Segoe UI" w:hAnsi="Segoe UI"/>
-          <w:b w:val="false"/>
-          <w:bCs w:val="false"/>
-          <w:color w:val="1E293B"/>
-          <w:sz w:val="22"/>
-          <w:szCs w:val="22"/>
-        </w:rPr>
-        <w:t xml:space="preserve">• Encaissement : Choisir le mode de paiement et remettre le reçu imprimé.</w:t>
-      </w:r>
-    </w:p>
-    <w:p>
-      <w:pPr>
-        <w:spacing w:after="120" w:line="280"/>
-      </w:pPr>
-      <w:r>
-        <w:rPr>
-          <w:rFonts w:ascii="Segoe UI" w:cs="Segoe UI" w:eastAsia="Segoe UI" w:hAnsi="Segoe UI"/>
-          <w:b w:val="false"/>
-          <w:bCs w:val="false"/>
-          <w:color w:val="1E293B"/>
-          <w:sz w:val="22"/>
-          <w:szCs w:val="22"/>
-        </w:rPr>
-        <w:t xml:space="preserve">• Envoi électronique : Cliquer sur « Mail » pour transmettre la facture à l'IPM ou au patient.</w:t>
-      </w:r>
-    </w:p>
-    <w:p>
-      <w:pPr>
-        <w:spacing w:after="120" w:line="280"/>
-      </w:pPr>
-      <w:r>
-        <w:rPr>
-          <w:rFonts w:ascii="Segoe UI" w:cs="Segoe UI" w:eastAsia="Segoe UI" w:hAnsi="Segoe UI"/>
-          <w:b w:val="false"/>
-          <w:bCs w:val="false"/>
-          <w:color w:val="1E293B"/>
-          <w:sz w:val="22"/>
-          <w:szCs w:val="22"/>
-        </w:rPr>
-        <w:t xml:space="preserve">• Fin de journée : Clôturer la caisse et imprimer le rapport récapitulatif.</w:t>
+        <w:t xml:space="preserve">• Facturation : Sélectionner le patient. Le calcul Tiers-Payant (Part Patient / Part IPM) est 100% automatique.</w:t>
+      </w:r>
+    </w:p>
+    <w:p>
+      <w:pPr>
+        <w:spacing w:after="120" w:line="280"/>
+      </w:pPr>
+      <w:r>
+        <w:rPr>
+          <w:rFonts w:ascii="Segoe UI" w:cs="Segoe UI" w:eastAsia="Segoe UI" w:hAnsi="Segoe UI"/>
+          <w:b w:val="false"/>
+          <w:bCs w:val="false"/>
+          <w:color w:val="1E293B"/>
+          <w:sz w:val="22"/>
+          <w:szCs w:val="22"/>
+        </w:rPr>
+        <w:t xml:space="preserve">• Encaissement : Choisir le mode de paiement (Espèces, Wave, OM) et imprimer le reçu.</w:t>
+      </w:r>
+    </w:p>
+    <w:p>
+      <w:pPr>
+        <w:spacing w:after="120" w:line="280"/>
+      </w:pPr>
+      <w:r>
+        <w:rPr>
+          <w:rFonts w:ascii="Segoe UI" w:cs="Segoe UI" w:eastAsia="Segoe UI" w:hAnsi="Segoe UI"/>
+          <w:b w:val="false"/>
+          <w:bCs w:val="false"/>
+          <w:color w:val="1E293B"/>
+          <w:sz w:val="22"/>
+          <w:szCs w:val="22"/>
+        </w:rPr>
+        <w:t xml:space="preserve">• Envoi électronique : Transmettre la facture et les pièces jointes par email.</w:t>
+      </w:r>
+    </w:p>
+    <w:p>
+      <w:pPr>
+        <w:spacing w:after="120" w:line="280"/>
+      </w:pPr>
+      <w:r>
+        <w:rPr>
+          <w:rFonts w:ascii="Segoe UI" w:cs="Segoe UI" w:eastAsia="Segoe UI" w:hAnsi="Segoe UI"/>
+          <w:b w:val="false"/>
+          <w:bCs w:val="false"/>
+          <w:color w:val="1E293B"/>
+          <w:sz w:val="22"/>
+          <w:szCs w:val="22"/>
+        </w:rPr>
+        <w:t xml:space="preserve">• Fin de journée : Clôturer la caisse et éditer le rapport récapitulatif.</w:t>
       </w:r>
     </w:p>
     <w:p>
@@ -4229,23 +4533,23 @@
           <w:sz w:val="22"/>
           <w:szCs w:val="22"/>
         </w:rPr>
-        <w:t xml:space="preserve">• Réception : Enregistrer les lots avec dates d'expiration.</w:t>
-      </w:r>
-    </w:p>
-    <w:p>
-      <w:pPr>
-        <w:spacing w:after="120" w:line="280"/>
-      </w:pPr>
-      <w:r>
-        <w:rPr>
-          <w:rFonts w:ascii="Segoe UI" w:cs="Segoe UI" w:eastAsia="Segoe UI" w:hAnsi="Segoe UI"/>
-          <w:b w:val="false"/>
-          <w:bCs w:val="false"/>
-          <w:color w:val="1E293B"/>
-          <w:sz w:val="22"/>
-          <w:szCs w:val="22"/>
-        </w:rPr>
-        <w:t xml:space="preserve">• Suivi : Contrôler la liste rouge des produits en alerte rupture.</w:t>
+        <w:t xml:space="preserve">• Réception : Enregistrer les lots fournisseurs avec dates de péremption.</w:t>
+      </w:r>
+    </w:p>
+    <w:p>
+      <w:pPr>
+        <w:spacing w:after="120" w:line="280"/>
+      </w:pPr>
+      <w:r>
+        <w:rPr>
+          <w:rFonts w:ascii="Segoe UI" w:cs="Segoe UI" w:eastAsia="Segoe UI" w:hAnsi="Segoe UI"/>
+          <w:b w:val="false"/>
+          <w:bCs w:val="false"/>
+          <w:color w:val="1E293B"/>
+          <w:sz w:val="22"/>
+          <w:szCs w:val="22"/>
+        </w:rPr>
+        <w:t xml:space="preserve">• Alertes : Surveiller les produits en alerte rouge pour réapprovisionner sans rupture.</w:t>
       </w:r>
     </w:p>
     <w:p>
@@ -4254,39 +4558,55 @@
         <w:spacing w:after="140" w:before="320"/>
       </w:pPr>
       <w:r>
-        <w:t xml:space="preserve">⚙️ Fiche Mémo 5 : Administrateur de la Clinique</w:t>
-      </w:r>
-    </w:p>
-    <w:p>
-      <w:pPr>
-        <w:spacing w:after="120" w:line="280"/>
-      </w:pPr>
-      <w:r>
-        <w:rPr>
-          <w:rFonts w:ascii="Segoe UI" w:cs="Segoe UI" w:eastAsia="Segoe UI" w:hAnsi="Segoe UI"/>
-          <w:b w:val="false"/>
-          <w:bCs w:val="false"/>
-          <w:color w:val="1E293B"/>
-          <w:sz w:val="22"/>
-          <w:szCs w:val="22"/>
-        </w:rPr>
-        <w:t xml:space="preserve">• Utilisateurs : Créer les comptes et ajuster les droits d'accès.</w:t>
-      </w:r>
-    </w:p>
-    <w:p>
-      <w:pPr>
-        <w:spacing w:after="120" w:line="280"/>
-      </w:pPr>
-      <w:r>
-        <w:rPr>
-          <w:rFonts w:ascii="Segoe UI" w:cs="Segoe UI" w:eastAsia="Segoe UI" w:hAnsi="Segoe UI"/>
-          <w:b w:val="false"/>
-          <w:bCs w:val="false"/>
-          <w:color w:val="1E293B"/>
-          <w:sz w:val="22"/>
-          <w:szCs w:val="22"/>
-        </w:rPr>
-        <w:t xml:space="preserve">• Paramètres généraux : Vérifier le cachet officiel, le logo et les comptes SMTP.</w:t>
+        <w:t xml:space="preserve">⚙️ Fiche Mémo 5 : Administrateur de la Structure Sanitaire</w:t>
+      </w:r>
+    </w:p>
+    <w:p>
+      <w:pPr>
+        <w:spacing w:after="120" w:line="280"/>
+      </w:pPr>
+      <w:r>
+        <w:rPr>
+          <w:rFonts w:ascii="Segoe UI" w:cs="Segoe UI" w:eastAsia="Segoe UI" w:hAnsi="Segoe UI"/>
+          <w:b w:val="false"/>
+          <w:bCs w:val="false"/>
+          <w:color w:val="1E293B"/>
+          <w:sz w:val="22"/>
+          <w:szCs w:val="22"/>
+        </w:rPr>
+        <w:t xml:space="preserve">• Utilisateurs : Créer les comptes d'accès et ajuster la matrice des permissions.</w:t>
+      </w:r>
+    </w:p>
+    <w:p>
+      <w:pPr>
+        <w:spacing w:after="120" w:line="280"/>
+      </w:pPr>
+      <w:r>
+        <w:rPr>
+          <w:rFonts w:ascii="Segoe UI" w:cs="Segoe UI" w:eastAsia="Segoe UI" w:hAnsi="Segoe UI"/>
+          <w:b w:val="false"/>
+          <w:bCs w:val="false"/>
+          <w:color w:val="1E293B"/>
+          <w:sz w:val="22"/>
+          <w:szCs w:val="22"/>
+        </w:rPr>
+        <w:t xml:space="preserve">• Fournisseur IA : Configurer la clé API (AIML API, OpenRouter, Gemini...) et tester la liaison.</w:t>
+      </w:r>
+    </w:p>
+    <w:p>
+      <w:pPr>
+        <w:spacing w:after="120" w:line="280"/>
+      </w:pPr>
+      <w:r>
+        <w:rPr>
+          <w:rFonts w:ascii="Segoe UI" w:cs="Segoe UI" w:eastAsia="Segoe UI" w:hAnsi="Segoe UI"/>
+          <w:b w:val="false"/>
+          <w:bCs w:val="false"/>
+          <w:color w:val="1E293B"/>
+          <w:sz w:val="22"/>
+          <w:szCs w:val="22"/>
+        </w:rPr>
+        <w:t xml:space="preserve">• Structure &amp; SMTP : Vérifier les informations officielles, logo, cachet et serveur mail.</w:t>
       </w:r>
     </w:p>
     <w:sectPr>

</xml_diff>